<commit_message>
Add smoothing model evaluation and update project progress
</commit_message>
<xml_diff>
--- a/docs/Model Selection.docx
+++ b/docs/Model Selection.docx
@@ -6,7 +6,7 @@
       <w:pPr>
         <w:pStyle w:val="Heading1"/>
       </w:pPr>
-      <w:bookmarkStart w:id="0" w:name="_Toc241156819"/>
+      <w:bookmarkStart w:id="0" w:name="_Toc241582150"/>
       <w:r>
         <w:t>Model Selection – F1 Lap Time Prediction</w:t>
       </w:r>
@@ -14,6 +14,15 @@
     </w:p>
     <w:sdt>
       <w:sdtPr>
+        <w:rPr>
+          <w:rFonts w:asciiTheme="minorHAnsi" w:eastAsiaTheme="minorHAnsi" w:hAnsiTheme="minorHAnsi" w:cstheme="minorBidi"/>
+          <w:color w:val="auto"/>
+          <w:kern w:val="2"/>
+          <w:sz w:val="24"/>
+          <w:szCs w:val="24"/>
+          <w:lang w:eastAsia="en-US"/>
+          <w14:ligatures w14:val="standardContextual"/>
+        </w:rPr>
         <w:id w:val="-2143104395"/>
         <w:docPartObj>
           <w:docPartGallery w:val="Table of Contents"/>
@@ -22,15 +31,8 @@
       </w:sdtPr>
       <w:sdtEndPr>
         <w:rPr>
-          <w:rFonts w:asciiTheme="minorHAnsi" w:eastAsiaTheme="minorHAnsi" w:hAnsiTheme="minorHAnsi" w:cstheme="minorBidi"/>
           <w:b/>
           <w:bCs/>
-          <w:color w:val="auto"/>
-          <w:kern w:val="2"/>
-          <w:sz w:val="24"/>
-          <w:szCs w:val="24"/>
-          <w:lang w:eastAsia="en-US"/>
-          <w14:ligatures w14:val="standardContextual"/>
         </w:rPr>
       </w:sdtEndPr>
       <w:sdtContent>
@@ -49,7 +51,9 @@
               <w:tab w:val="right" w:leader="dot" w:pos="9016"/>
             </w:tabs>
             <w:rPr>
+              <w:rFonts w:eastAsiaTheme="minorEastAsia"/>
               <w:noProof/>
+              <w:lang w:eastAsia="en-GB"/>
             </w:rPr>
           </w:pPr>
           <w:r>
@@ -61,7 +65,7 @@
           <w:r>
             <w:fldChar w:fldCharType="separate"/>
           </w:r>
-          <w:hyperlink w:anchor="_Toc241156819" w:history="1">
+          <w:hyperlink w:anchor="_Toc241582150" w:history="1">
             <w:r>
               <w:rPr>
                 <w:rStyle w:val="Hyperlink"/>
@@ -88,7 +92,7 @@
                 <w:noProof/>
                 <w:webHidden/>
               </w:rPr>
-              <w:instrText xml:space="preserve"> PAGEREF _Toc241156819 \h </w:instrText>
+              <w:instrText xml:space="preserve"> PAGEREF _Toc241582150 \h </w:instrText>
             </w:r>
             <w:r>
               <w:rPr>
@@ -126,10 +130,12 @@
               <w:tab w:val="right" w:leader="dot" w:pos="9016"/>
             </w:tabs>
             <w:rPr>
+              <w:rFonts w:eastAsiaTheme="minorEastAsia"/>
               <w:noProof/>
+              <w:lang w:eastAsia="en-GB"/>
             </w:rPr>
           </w:pPr>
-          <w:hyperlink w:anchor="_Toc241156820" w:history="1">
+          <w:hyperlink w:anchor="_Toc241582151" w:history="1">
             <w:r>
               <w:rPr>
                 <w:rStyle w:val="Hyperlink"/>
@@ -156,7 +162,7 @@
                 <w:noProof/>
                 <w:webHidden/>
               </w:rPr>
-              <w:instrText xml:space="preserve"> PAGEREF _Toc241156820 \h </w:instrText>
+              <w:instrText xml:space="preserve"> PAGEREF _Toc241582151 \h </w:instrText>
             </w:r>
             <w:r>
               <w:rPr>
@@ -194,10 +200,12 @@
               <w:tab w:val="right" w:leader="dot" w:pos="9016"/>
             </w:tabs>
             <w:rPr>
+              <w:rFonts w:eastAsiaTheme="minorEastAsia"/>
               <w:noProof/>
+              <w:lang w:eastAsia="en-GB"/>
             </w:rPr>
           </w:pPr>
-          <w:hyperlink w:anchor="_Toc241156821" w:history="1">
+          <w:hyperlink w:anchor="_Toc241582152" w:history="1">
             <w:r>
               <w:rPr>
                 <w:rStyle w:val="Hyperlink"/>
@@ -224,7 +232,7 @@
                 <w:noProof/>
                 <w:webHidden/>
               </w:rPr>
-              <w:instrText xml:space="preserve"> PAGEREF _Toc241156821 \h </w:instrText>
+              <w:instrText xml:space="preserve"> PAGEREF _Toc241582152 \h </w:instrText>
             </w:r>
             <w:r>
               <w:rPr>
@@ -262,10 +270,12 @@
               <w:tab w:val="right" w:leader="dot" w:pos="9016"/>
             </w:tabs>
             <w:rPr>
+              <w:rFonts w:eastAsiaTheme="minorEastAsia"/>
               <w:noProof/>
+              <w:lang w:eastAsia="en-GB"/>
             </w:rPr>
           </w:pPr>
-          <w:hyperlink w:anchor="_Toc241156822" w:history="1">
+          <w:hyperlink w:anchor="_Toc241582153" w:history="1">
             <w:r>
               <w:rPr>
                 <w:rStyle w:val="Hyperlink"/>
@@ -292,7 +302,7 @@
                 <w:noProof/>
                 <w:webHidden/>
               </w:rPr>
-              <w:instrText xml:space="preserve"> PAGEREF _Toc241156822 \h </w:instrText>
+              <w:instrText xml:space="preserve"> PAGEREF _Toc241582153 \h </w:instrText>
             </w:r>
             <w:r>
               <w:rPr>
@@ -330,10 +340,12 @@
               <w:tab w:val="right" w:leader="dot" w:pos="9016"/>
             </w:tabs>
             <w:rPr>
+              <w:rFonts w:eastAsiaTheme="minorEastAsia"/>
               <w:noProof/>
+              <w:lang w:eastAsia="en-GB"/>
             </w:rPr>
           </w:pPr>
-          <w:hyperlink w:anchor="_Toc241156823" w:history="1">
+          <w:hyperlink w:anchor="_Toc241582154" w:history="1">
             <w:r>
               <w:rPr>
                 <w:rStyle w:val="Hyperlink"/>
@@ -360,7 +372,7 @@
                 <w:noProof/>
                 <w:webHidden/>
               </w:rPr>
-              <w:instrText xml:space="preserve"> PAGEREF _Toc241156823 \h </w:instrText>
+              <w:instrText xml:space="preserve"> PAGEREF _Toc241582154 \h </w:instrText>
             </w:r>
             <w:r>
               <w:rPr>
@@ -380,7 +392,7 @@
                 <w:noProof/>
                 <w:webHidden/>
               </w:rPr>
-              <w:t>2</w:t>
+              <w:t>1</w:t>
             </w:r>
             <w:r>
               <w:rPr>
@@ -398,16 +410,18 @@
               <w:tab w:val="right" w:leader="dot" w:pos="9016"/>
             </w:tabs>
             <w:rPr>
+              <w:rFonts w:eastAsiaTheme="minorEastAsia"/>
               <w:noProof/>
+              <w:lang w:eastAsia="en-GB"/>
             </w:rPr>
           </w:pPr>
-          <w:hyperlink w:anchor="_Toc241156824" w:history="1">
+          <w:hyperlink w:anchor="_Toc241582155" w:history="1">
             <w:r>
               <w:rPr>
                 <w:rStyle w:val="Hyperlink"/>
                 <w:noProof/>
               </w:rPr>
-              <w:t>Regression Models</w:t>
+              <w:t>Linear Regression</w:t>
             </w:r>
             <w:r>
               <w:rPr>
@@ -428,7 +442,7 @@
                 <w:noProof/>
                 <w:webHidden/>
               </w:rPr>
-              <w:instrText xml:space="preserve"> PAGEREF _Toc241156824 \h </w:instrText>
+              <w:instrText xml:space="preserve"> PAGEREF _Toc241582155 \h </w:instrText>
             </w:r>
             <w:r>
               <w:rPr>
@@ -448,7 +462,427 @@
                 <w:noProof/>
                 <w:webHidden/>
               </w:rPr>
-              <w:t>2</w:t>
+              <w:t>1</w:t>
+            </w:r>
+            <w:r>
+              <w:rPr>
+                <w:noProof/>
+                <w:webHidden/>
+              </w:rPr>
+              <w:fldChar w:fldCharType="end"/>
+            </w:r>
+          </w:hyperlink>
+        </w:p>
+        <w:p>
+          <w:pPr>
+            <w:pStyle w:val="TOC2"/>
+            <w:tabs>
+              <w:tab w:val="right" w:leader="dot" w:pos="9016"/>
+            </w:tabs>
+            <w:rPr>
+              <w:rFonts w:eastAsiaTheme="minorEastAsia"/>
+              <w:noProof/>
+              <w:lang w:eastAsia="en-GB"/>
+            </w:rPr>
+          </w:pPr>
+          <w:hyperlink w:anchor="_Toc241582156" w:history="1">
+            <w:r>
+              <w:rPr>
+                <w:rStyle w:val="Hyperlink"/>
+                <w:noProof/>
+              </w:rPr>
+              <w:t>Persistent Baseline</w:t>
+            </w:r>
+            <w:r>
+              <w:rPr>
+                <w:noProof/>
+                <w:webHidden/>
+              </w:rPr>
+              <w:tab/>
+            </w:r>
+            <w:r>
+              <w:rPr>
+                <w:noProof/>
+                <w:webHidden/>
+              </w:rPr>
+              <w:fldChar w:fldCharType="begin"/>
+            </w:r>
+            <w:r>
+              <w:rPr>
+                <w:noProof/>
+                <w:webHidden/>
+              </w:rPr>
+              <w:instrText xml:space="preserve"> PAGEREF _Toc241582156 \h </w:instrText>
+            </w:r>
+            <w:r>
+              <w:rPr>
+                <w:noProof/>
+                <w:webHidden/>
+              </w:rPr>
+            </w:r>
+            <w:r>
+              <w:rPr>
+                <w:noProof/>
+                <w:webHidden/>
+              </w:rPr>
+              <w:fldChar w:fldCharType="separate"/>
+            </w:r>
+            <w:r>
+              <w:rPr>
+                <w:noProof/>
+                <w:webHidden/>
+              </w:rPr>
+              <w:t>1</w:t>
+            </w:r>
+            <w:r>
+              <w:rPr>
+                <w:noProof/>
+                <w:webHidden/>
+              </w:rPr>
+              <w:fldChar w:fldCharType="end"/>
+            </w:r>
+          </w:hyperlink>
+        </w:p>
+        <w:p>
+          <w:pPr>
+            <w:pStyle w:val="TOC1"/>
+            <w:tabs>
+              <w:tab w:val="right" w:leader="dot" w:pos="9016"/>
+            </w:tabs>
+            <w:rPr>
+              <w:rFonts w:eastAsiaTheme="minorEastAsia"/>
+              <w:noProof/>
+              <w:lang w:eastAsia="en-GB"/>
+            </w:rPr>
+          </w:pPr>
+          <w:hyperlink w:anchor="_Toc241582157" w:history="1">
+            <w:r>
+              <w:rPr>
+                <w:rStyle w:val="Hyperlink"/>
+                <w:noProof/>
+              </w:rPr>
+              <w:t>Time Series Forecasting Models</w:t>
+            </w:r>
+            <w:r>
+              <w:rPr>
+                <w:noProof/>
+                <w:webHidden/>
+              </w:rPr>
+              <w:tab/>
+            </w:r>
+            <w:r>
+              <w:rPr>
+                <w:noProof/>
+                <w:webHidden/>
+              </w:rPr>
+              <w:fldChar w:fldCharType="begin"/>
+            </w:r>
+            <w:r>
+              <w:rPr>
+                <w:noProof/>
+                <w:webHidden/>
+              </w:rPr>
+              <w:instrText xml:space="preserve"> PAGEREF _Toc241582157 \h </w:instrText>
+            </w:r>
+            <w:r>
+              <w:rPr>
+                <w:noProof/>
+                <w:webHidden/>
+              </w:rPr>
+            </w:r>
+            <w:r>
+              <w:rPr>
+                <w:noProof/>
+                <w:webHidden/>
+              </w:rPr>
+              <w:fldChar w:fldCharType="separate"/>
+            </w:r>
+            <w:r>
+              <w:rPr>
+                <w:noProof/>
+                <w:webHidden/>
+              </w:rPr>
+              <w:t>1</w:t>
+            </w:r>
+            <w:r>
+              <w:rPr>
+                <w:noProof/>
+                <w:webHidden/>
+              </w:rPr>
+              <w:fldChar w:fldCharType="end"/>
+            </w:r>
+          </w:hyperlink>
+        </w:p>
+        <w:p>
+          <w:pPr>
+            <w:pStyle w:val="TOC2"/>
+            <w:tabs>
+              <w:tab w:val="right" w:leader="dot" w:pos="9016"/>
+            </w:tabs>
+            <w:rPr>
+              <w:rFonts w:eastAsiaTheme="minorEastAsia"/>
+              <w:noProof/>
+              <w:lang w:eastAsia="en-GB"/>
+            </w:rPr>
+          </w:pPr>
+          <w:hyperlink w:anchor="_Toc241582158" w:history="1">
+            <w:r>
+              <w:rPr>
+                <w:rStyle w:val="Hyperlink"/>
+                <w:noProof/>
+              </w:rPr>
+              <w:t>ARIMA</w:t>
+            </w:r>
+            <w:r>
+              <w:rPr>
+                <w:noProof/>
+                <w:webHidden/>
+              </w:rPr>
+              <w:tab/>
+            </w:r>
+            <w:r>
+              <w:rPr>
+                <w:noProof/>
+                <w:webHidden/>
+              </w:rPr>
+              <w:fldChar w:fldCharType="begin"/>
+            </w:r>
+            <w:r>
+              <w:rPr>
+                <w:noProof/>
+                <w:webHidden/>
+              </w:rPr>
+              <w:instrText xml:space="preserve"> PAGEREF _Toc241582158 \h </w:instrText>
+            </w:r>
+            <w:r>
+              <w:rPr>
+                <w:noProof/>
+                <w:webHidden/>
+              </w:rPr>
+            </w:r>
+            <w:r>
+              <w:rPr>
+                <w:noProof/>
+                <w:webHidden/>
+              </w:rPr>
+              <w:fldChar w:fldCharType="separate"/>
+            </w:r>
+            <w:r>
+              <w:rPr>
+                <w:noProof/>
+                <w:webHidden/>
+              </w:rPr>
+              <w:t>1</w:t>
+            </w:r>
+            <w:r>
+              <w:rPr>
+                <w:noProof/>
+                <w:webHidden/>
+              </w:rPr>
+              <w:fldChar w:fldCharType="end"/>
+            </w:r>
+          </w:hyperlink>
+        </w:p>
+        <w:p>
+          <w:pPr>
+            <w:pStyle w:val="TOC2"/>
+            <w:tabs>
+              <w:tab w:val="right" w:leader="dot" w:pos="9016"/>
+            </w:tabs>
+            <w:rPr>
+              <w:rFonts w:eastAsiaTheme="minorEastAsia"/>
+              <w:noProof/>
+              <w:lang w:eastAsia="en-GB"/>
+            </w:rPr>
+          </w:pPr>
+          <w:hyperlink w:anchor="_Toc241582159" w:history="1">
+            <w:r>
+              <w:rPr>
+                <w:rStyle w:val="Hyperlink"/>
+                <w:noProof/>
+              </w:rPr>
+              <w:t>ARIMA with external features using SARIMAX</w:t>
+            </w:r>
+            <w:r>
+              <w:rPr>
+                <w:noProof/>
+                <w:webHidden/>
+              </w:rPr>
+              <w:tab/>
+            </w:r>
+            <w:r>
+              <w:rPr>
+                <w:noProof/>
+                <w:webHidden/>
+              </w:rPr>
+              <w:fldChar w:fldCharType="begin"/>
+            </w:r>
+            <w:r>
+              <w:rPr>
+                <w:noProof/>
+                <w:webHidden/>
+              </w:rPr>
+              <w:instrText xml:space="preserve"> PAGEREF _Toc241582159 \h </w:instrText>
+            </w:r>
+            <w:r>
+              <w:rPr>
+                <w:noProof/>
+                <w:webHidden/>
+              </w:rPr>
+            </w:r>
+            <w:r>
+              <w:rPr>
+                <w:noProof/>
+                <w:webHidden/>
+              </w:rPr>
+              <w:fldChar w:fldCharType="separate"/>
+            </w:r>
+            <w:r>
+              <w:rPr>
+                <w:noProof/>
+                <w:webHidden/>
+              </w:rPr>
+              <w:t>1</w:t>
+            </w:r>
+            <w:r>
+              <w:rPr>
+                <w:noProof/>
+                <w:webHidden/>
+              </w:rPr>
+              <w:fldChar w:fldCharType="end"/>
+            </w:r>
+          </w:hyperlink>
+        </w:p>
+        <w:p>
+          <w:pPr>
+            <w:pStyle w:val="TOC2"/>
+            <w:tabs>
+              <w:tab w:val="right" w:leader="dot" w:pos="9016"/>
+            </w:tabs>
+            <w:rPr>
+              <w:rFonts w:eastAsiaTheme="minorEastAsia"/>
+              <w:noProof/>
+              <w:lang w:eastAsia="en-GB"/>
+            </w:rPr>
+          </w:pPr>
+          <w:hyperlink w:anchor="_Toc241582160" w:history="1">
+            <w:r>
+              <w:rPr>
+                <w:rStyle w:val="Hyperlink"/>
+                <w:noProof/>
+              </w:rPr>
+              <w:t>Exponential Smoothing</w:t>
+            </w:r>
+            <w:r>
+              <w:rPr>
+                <w:noProof/>
+                <w:webHidden/>
+              </w:rPr>
+              <w:tab/>
+            </w:r>
+            <w:r>
+              <w:rPr>
+                <w:noProof/>
+                <w:webHidden/>
+              </w:rPr>
+              <w:fldChar w:fldCharType="begin"/>
+            </w:r>
+            <w:r>
+              <w:rPr>
+                <w:noProof/>
+                <w:webHidden/>
+              </w:rPr>
+              <w:instrText xml:space="preserve"> PAGEREF _Toc241582160 \h </w:instrText>
+            </w:r>
+            <w:r>
+              <w:rPr>
+                <w:noProof/>
+                <w:webHidden/>
+              </w:rPr>
+            </w:r>
+            <w:r>
+              <w:rPr>
+                <w:noProof/>
+                <w:webHidden/>
+              </w:rPr>
+              <w:fldChar w:fldCharType="separate"/>
+            </w:r>
+            <w:r>
+              <w:rPr>
+                <w:noProof/>
+                <w:webHidden/>
+              </w:rPr>
+              <w:t>1</w:t>
+            </w:r>
+            <w:r>
+              <w:rPr>
+                <w:noProof/>
+                <w:webHidden/>
+              </w:rPr>
+              <w:fldChar w:fldCharType="end"/>
+            </w:r>
+          </w:hyperlink>
+        </w:p>
+        <w:p>
+          <w:pPr>
+            <w:pStyle w:val="TOC2"/>
+            <w:tabs>
+              <w:tab w:val="right" w:leader="dot" w:pos="9016"/>
+            </w:tabs>
+            <w:rPr>
+              <w:rFonts w:eastAsiaTheme="minorEastAsia"/>
+              <w:noProof/>
+              <w:lang w:eastAsia="en-GB"/>
+            </w:rPr>
+          </w:pPr>
+          <w:hyperlink w:anchor="_Toc241582161" w:history="1">
+            <w:r>
+              <w:rPr>
+                <w:rStyle w:val="Hyperlink"/>
+                <w:noProof/>
+              </w:rPr>
+              <w:t>LSTM as an extension</w:t>
+            </w:r>
+            <w:r>
+              <w:rPr>
+                <w:noProof/>
+                <w:webHidden/>
+              </w:rPr>
+              <w:tab/>
+            </w:r>
+            <w:r>
+              <w:rPr>
+                <w:noProof/>
+                <w:webHidden/>
+              </w:rPr>
+              <w:fldChar w:fldCharType="begin"/>
+            </w:r>
+            <w:r>
+              <w:rPr>
+                <w:noProof/>
+                <w:webHidden/>
+              </w:rPr>
+              <w:instrText xml:space="preserve"> PAGEREF _Toc241582161 \h </w:instrText>
+            </w:r>
+            <w:r>
+              <w:rPr>
+                <w:noProof/>
+                <w:webHidden/>
+              </w:rPr>
+            </w:r>
+            <w:r>
+              <w:rPr>
+                <w:noProof/>
+                <w:webHidden/>
+              </w:rPr>
+              <w:fldChar w:fldCharType="separate"/>
+            </w:r>
+            <w:r>
+              <w:rPr>
+                <w:noProof/>
+                <w:webHidden/>
+              </w:rPr>
+              <w:t>1</w:t>
             </w:r>
             <w:r>
               <w:rPr>
@@ -466,10 +900,12 @@
               <w:tab w:val="right" w:leader="dot" w:pos="9016"/>
             </w:tabs>
             <w:rPr>
+              <w:rFonts w:eastAsiaTheme="minorEastAsia"/>
               <w:noProof/>
+              <w:lang w:eastAsia="en-GB"/>
             </w:rPr>
           </w:pPr>
-          <w:hyperlink w:anchor="_Toc241156825" w:history="1">
+          <w:hyperlink w:anchor="_Toc241582162" w:history="1">
             <w:r>
               <w:rPr>
                 <w:rStyle w:val="Hyperlink"/>
@@ -496,7 +932,7 @@
                 <w:noProof/>
                 <w:webHidden/>
               </w:rPr>
-              <w:instrText xml:space="preserve"> PAGEREF _Toc241156825 \h </w:instrText>
+              <w:instrText xml:space="preserve"> PAGEREF _Toc241582162 \h </w:instrText>
             </w:r>
             <w:r>
               <w:rPr>
@@ -516,7 +952,217 @@
                 <w:noProof/>
                 <w:webHidden/>
               </w:rPr>
-              <w:t>2</w:t>
+              <w:t>1</w:t>
+            </w:r>
+            <w:r>
+              <w:rPr>
+                <w:noProof/>
+                <w:webHidden/>
+              </w:rPr>
+              <w:fldChar w:fldCharType="end"/>
+            </w:r>
+          </w:hyperlink>
+        </w:p>
+        <w:p>
+          <w:pPr>
+            <w:pStyle w:val="TOC1"/>
+            <w:tabs>
+              <w:tab w:val="right" w:leader="dot" w:pos="9016"/>
+            </w:tabs>
+            <w:rPr>
+              <w:rFonts w:eastAsiaTheme="minorEastAsia"/>
+              <w:noProof/>
+              <w:lang w:eastAsia="en-GB"/>
+            </w:rPr>
+          </w:pPr>
+          <w:hyperlink w:anchor="_Toc241582163" w:history="1">
+            <w:r>
+              <w:rPr>
+                <w:rStyle w:val="Hyperlink"/>
+                <w:noProof/>
+              </w:rPr>
+              <w:t>Forecasting Setup</w:t>
+            </w:r>
+            <w:r>
+              <w:rPr>
+                <w:noProof/>
+                <w:webHidden/>
+              </w:rPr>
+              <w:tab/>
+            </w:r>
+            <w:r>
+              <w:rPr>
+                <w:noProof/>
+                <w:webHidden/>
+              </w:rPr>
+              <w:fldChar w:fldCharType="begin"/>
+            </w:r>
+            <w:r>
+              <w:rPr>
+                <w:noProof/>
+                <w:webHidden/>
+              </w:rPr>
+              <w:instrText xml:space="preserve"> PAGEREF _Toc241582163 \h </w:instrText>
+            </w:r>
+            <w:r>
+              <w:rPr>
+                <w:noProof/>
+                <w:webHidden/>
+              </w:rPr>
+            </w:r>
+            <w:r>
+              <w:rPr>
+                <w:noProof/>
+                <w:webHidden/>
+              </w:rPr>
+              <w:fldChar w:fldCharType="separate"/>
+            </w:r>
+            <w:r>
+              <w:rPr>
+                <w:noProof/>
+                <w:webHidden/>
+              </w:rPr>
+              <w:t>1</w:t>
+            </w:r>
+            <w:r>
+              <w:rPr>
+                <w:noProof/>
+                <w:webHidden/>
+              </w:rPr>
+              <w:fldChar w:fldCharType="end"/>
+            </w:r>
+          </w:hyperlink>
+        </w:p>
+        <w:p>
+          <w:pPr>
+            <w:pStyle w:val="TOC1"/>
+            <w:tabs>
+              <w:tab w:val="right" w:leader="dot" w:pos="9016"/>
+            </w:tabs>
+            <w:rPr>
+              <w:rFonts w:eastAsiaTheme="minorEastAsia"/>
+              <w:noProof/>
+              <w:lang w:eastAsia="en-GB"/>
+            </w:rPr>
+          </w:pPr>
+          <w:hyperlink w:anchor="_Toc241582164" w:history="1">
+            <w:r>
+              <w:rPr>
+                <w:rStyle w:val="Hyperlink"/>
+                <w:noProof/>
+              </w:rPr>
+              <w:t>Model Evaluation</w:t>
+            </w:r>
+            <w:r>
+              <w:rPr>
+                <w:noProof/>
+                <w:webHidden/>
+              </w:rPr>
+              <w:tab/>
+            </w:r>
+            <w:r>
+              <w:rPr>
+                <w:noProof/>
+                <w:webHidden/>
+              </w:rPr>
+              <w:fldChar w:fldCharType="begin"/>
+            </w:r>
+            <w:r>
+              <w:rPr>
+                <w:noProof/>
+                <w:webHidden/>
+              </w:rPr>
+              <w:instrText xml:space="preserve"> PAGEREF _Toc241582164 \h </w:instrText>
+            </w:r>
+            <w:r>
+              <w:rPr>
+                <w:noProof/>
+                <w:webHidden/>
+              </w:rPr>
+            </w:r>
+            <w:r>
+              <w:rPr>
+                <w:noProof/>
+                <w:webHidden/>
+              </w:rPr>
+              <w:fldChar w:fldCharType="separate"/>
+            </w:r>
+            <w:r>
+              <w:rPr>
+                <w:noProof/>
+                <w:webHidden/>
+              </w:rPr>
+              <w:t>1</w:t>
+            </w:r>
+            <w:r>
+              <w:rPr>
+                <w:noProof/>
+                <w:webHidden/>
+              </w:rPr>
+              <w:fldChar w:fldCharType="end"/>
+            </w:r>
+          </w:hyperlink>
+        </w:p>
+        <w:p>
+          <w:pPr>
+            <w:pStyle w:val="TOC1"/>
+            <w:tabs>
+              <w:tab w:val="right" w:leader="dot" w:pos="9016"/>
+            </w:tabs>
+            <w:rPr>
+              <w:rFonts w:eastAsiaTheme="minorEastAsia"/>
+              <w:noProof/>
+              <w:lang w:eastAsia="en-GB"/>
+            </w:rPr>
+          </w:pPr>
+          <w:hyperlink w:anchor="_Toc241582165" w:history="1">
+            <w:r>
+              <w:rPr>
+                <w:rStyle w:val="Hyperlink"/>
+                <w:noProof/>
+              </w:rPr>
+              <w:t>Conclusion</w:t>
+            </w:r>
+            <w:r>
+              <w:rPr>
+                <w:noProof/>
+                <w:webHidden/>
+              </w:rPr>
+              <w:tab/>
+            </w:r>
+            <w:r>
+              <w:rPr>
+                <w:noProof/>
+                <w:webHidden/>
+              </w:rPr>
+              <w:fldChar w:fldCharType="begin"/>
+            </w:r>
+            <w:r>
+              <w:rPr>
+                <w:noProof/>
+                <w:webHidden/>
+              </w:rPr>
+              <w:instrText xml:space="preserve"> PAGEREF _Toc241582165 \h </w:instrText>
+            </w:r>
+            <w:r>
+              <w:rPr>
+                <w:noProof/>
+                <w:webHidden/>
+              </w:rPr>
+            </w:r>
+            <w:r>
+              <w:rPr>
+                <w:noProof/>
+                <w:webHidden/>
+              </w:rPr>
+              <w:fldChar w:fldCharType="separate"/>
+            </w:r>
+            <w:r>
+              <w:rPr>
+                <w:noProof/>
+                <w:webHidden/>
+              </w:rPr>
+              <w:t>1</w:t>
             </w:r>
             <w:r>
               <w:rPr>
@@ -534,16 +1180,18 @@
               <w:tab w:val="right" w:leader="dot" w:pos="9016"/>
             </w:tabs>
             <w:rPr>
+              <w:rFonts w:eastAsiaTheme="minorEastAsia"/>
               <w:noProof/>
+              <w:lang w:eastAsia="en-GB"/>
             </w:rPr>
           </w:pPr>
-          <w:hyperlink w:anchor="_Toc241156826" w:history="1">
+          <w:hyperlink w:anchor="_Toc241582166" w:history="1">
             <w:r>
               <w:rPr>
                 <w:rStyle w:val="Hyperlink"/>
                 <w:noProof/>
               </w:rPr>
-              <w:t>Time Series Forecasting Models</w:t>
+              <w:t>References</w:t>
             </w:r>
             <w:r>
               <w:rPr>
@@ -564,7 +1212,7 @@
                 <w:noProof/>
                 <w:webHidden/>
               </w:rPr>
-              <w:instrText xml:space="preserve"> PAGEREF _Toc241156826 \h </w:instrText>
+              <w:instrText xml:space="preserve"> PAGEREF _Toc241582166 \h </w:instrText>
             </w:r>
             <w:r>
               <w:rPr>
@@ -584,211 +1232,7 @@
                 <w:noProof/>
                 <w:webHidden/>
               </w:rPr>
-              <w:t>3</w:t>
-            </w:r>
-            <w:r>
-              <w:rPr>
-                <w:noProof/>
-                <w:webHidden/>
-              </w:rPr>
-              <w:fldChar w:fldCharType="end"/>
-            </w:r>
-          </w:hyperlink>
-        </w:p>
-        <w:p>
-          <w:pPr>
-            <w:pStyle w:val="TOC3"/>
-            <w:tabs>
-              <w:tab w:val="right" w:leader="dot" w:pos="9016"/>
-            </w:tabs>
-            <w:rPr>
-              <w:noProof/>
-            </w:rPr>
-          </w:pPr>
-          <w:hyperlink w:anchor="_Toc241156827" w:history="1">
-            <w:r>
-              <w:rPr>
-                <w:rStyle w:val="Hyperlink"/>
-                <w:noProof/>
-              </w:rPr>
-              <w:t>Model Comparison</w:t>
-            </w:r>
-            <w:r>
-              <w:rPr>
-                <w:noProof/>
-                <w:webHidden/>
-              </w:rPr>
-              <w:tab/>
-            </w:r>
-            <w:r>
-              <w:rPr>
-                <w:noProof/>
-                <w:webHidden/>
-              </w:rPr>
-              <w:fldChar w:fldCharType="begin"/>
-            </w:r>
-            <w:r>
-              <w:rPr>
-                <w:noProof/>
-                <w:webHidden/>
-              </w:rPr>
-              <w:instrText xml:space="preserve"> PAGEREF _Toc241156827 \h </w:instrText>
-            </w:r>
-            <w:r>
-              <w:rPr>
-                <w:noProof/>
-                <w:webHidden/>
-              </w:rPr>
-            </w:r>
-            <w:r>
-              <w:rPr>
-                <w:noProof/>
-                <w:webHidden/>
-              </w:rPr>
-              <w:fldChar w:fldCharType="separate"/>
-            </w:r>
-            <w:r>
-              <w:rPr>
-                <w:noProof/>
-                <w:webHidden/>
-              </w:rPr>
-              <w:t>3</w:t>
-            </w:r>
-            <w:r>
-              <w:rPr>
-                <w:noProof/>
-                <w:webHidden/>
-              </w:rPr>
-              <w:fldChar w:fldCharType="end"/>
-            </w:r>
-          </w:hyperlink>
-        </w:p>
-        <w:p>
-          <w:pPr>
-            <w:pStyle w:val="TOC2"/>
-            <w:tabs>
-              <w:tab w:val="right" w:leader="dot" w:pos="9016"/>
-            </w:tabs>
-            <w:rPr>
-              <w:noProof/>
-            </w:rPr>
-          </w:pPr>
-          <w:hyperlink w:anchor="_Toc241156828" w:history="1">
-            <w:r>
-              <w:rPr>
-                <w:rStyle w:val="Hyperlink"/>
-                <w:noProof/>
-              </w:rPr>
-              <w:t>Conclusion</w:t>
-            </w:r>
-            <w:r>
-              <w:rPr>
-                <w:noProof/>
-                <w:webHidden/>
-              </w:rPr>
-              <w:tab/>
-            </w:r>
-            <w:r>
-              <w:rPr>
-                <w:noProof/>
-                <w:webHidden/>
-              </w:rPr>
-              <w:fldChar w:fldCharType="begin"/>
-            </w:r>
-            <w:r>
-              <w:rPr>
-                <w:noProof/>
-                <w:webHidden/>
-              </w:rPr>
-              <w:instrText xml:space="preserve"> PAGEREF _Toc241156828 \h </w:instrText>
-            </w:r>
-            <w:r>
-              <w:rPr>
-                <w:noProof/>
-                <w:webHidden/>
-              </w:rPr>
-            </w:r>
-            <w:r>
-              <w:rPr>
-                <w:noProof/>
-                <w:webHidden/>
-              </w:rPr>
-              <w:fldChar w:fldCharType="separate"/>
-            </w:r>
-            <w:r>
-              <w:rPr>
-                <w:noProof/>
-                <w:webHidden/>
-              </w:rPr>
-              <w:t>3</w:t>
-            </w:r>
-            <w:r>
-              <w:rPr>
-                <w:noProof/>
-                <w:webHidden/>
-              </w:rPr>
-              <w:fldChar w:fldCharType="end"/>
-            </w:r>
-          </w:hyperlink>
-        </w:p>
-        <w:p>
-          <w:pPr>
-            <w:pStyle w:val="TOC2"/>
-            <w:tabs>
-              <w:tab w:val="right" w:leader="dot" w:pos="9016"/>
-            </w:tabs>
-            <w:rPr>
-              <w:noProof/>
-            </w:rPr>
-          </w:pPr>
-          <w:hyperlink w:anchor="_Toc241156829" w:history="1">
-            <w:r>
-              <w:rPr>
-                <w:rStyle w:val="Hyperlink"/>
-                <w:noProof/>
-              </w:rPr>
-              <w:t>References</w:t>
-            </w:r>
-            <w:r>
-              <w:rPr>
-                <w:noProof/>
-                <w:webHidden/>
-              </w:rPr>
-              <w:tab/>
-            </w:r>
-            <w:r>
-              <w:rPr>
-                <w:noProof/>
-                <w:webHidden/>
-              </w:rPr>
-              <w:fldChar w:fldCharType="begin"/>
-            </w:r>
-            <w:r>
-              <w:rPr>
-                <w:noProof/>
-                <w:webHidden/>
-              </w:rPr>
-              <w:instrText xml:space="preserve"> PAGEREF _Toc241156829 \h </w:instrText>
-            </w:r>
-            <w:r>
-              <w:rPr>
-                <w:noProof/>
-                <w:webHidden/>
-              </w:rPr>
-            </w:r>
-            <w:r>
-              <w:rPr>
-                <w:noProof/>
-                <w:webHidden/>
-              </w:rPr>
-              <w:fldChar w:fldCharType="separate"/>
-            </w:r>
-            <w:r>
-              <w:rPr>
-                <w:noProof/>
-                <w:webHidden/>
-              </w:rPr>
-              <w:t>4</w:t>
+              <w:t>1</w:t>
             </w:r>
             <w:r>
               <w:rPr>
@@ -814,7 +1258,7 @@
       <w:pPr>
         <w:pStyle w:val="Heading2"/>
       </w:pPr>
-      <w:bookmarkStart w:id="1" w:name="_Toc241156820"/>
+      <w:bookmarkStart w:id="1" w:name="_Toc241582151"/>
       <w:r>
         <w:t>Introduction</w:t>
       </w:r>
@@ -874,8 +1318,9 @@
       <w:pPr>
         <w:pStyle w:val="Heading2"/>
       </w:pPr>
-      <w:bookmarkStart w:id="2" w:name="_Toc241156821"/>
-      <w:r>
+      <w:bookmarkStart w:id="2" w:name="_Toc241582152"/>
+      <w:r>
+        <w:lastRenderedPageBreak/>
         <w:t>Problem Characteristics</w:t>
       </w:r>
       <w:bookmarkEnd w:id="2"/>
@@ -892,7 +1337,7 @@
       <w:pPr>
         <w:pStyle w:val="Heading2"/>
       </w:pPr>
-      <w:bookmarkStart w:id="3" w:name="_Toc241156822"/>
+      <w:bookmarkStart w:id="3" w:name="_Toc241582153"/>
       <w:r>
         <w:t>Model Selection Criteria</w:t>
       </w:r>
@@ -905,7 +1350,6 @@
     </w:p>
     <w:p>
       <w:r>
-        <w:lastRenderedPageBreak/>
         <w:t>The first requirement is that the model must support the prediction of a continuous value, since the target variable is the next lap time measured in seconds.</w:t>
       </w:r>
     </w:p>
@@ -937,7 +1381,7 @@
       <w:pPr>
         <w:pStyle w:val="Heading2"/>
       </w:pPr>
-      <w:bookmarkStart w:id="4" w:name="_Toc241156823"/>
+      <w:bookmarkStart w:id="4" w:name="_Toc241582154"/>
       <w:r>
         <w:t>Possible Modelling Approaches</w:t>
       </w:r>
@@ -947,87 +1391,357 @@
       <w:pPr>
         <w:pStyle w:val="Heading3"/>
       </w:pPr>
-      <w:bookmarkStart w:id="5" w:name="_Toc241156824"/>
-      <w:r>
-        <w:t>Regression Models</w:t>
+      <w:bookmarkStart w:id="5" w:name="_Toc241582155"/>
+      <w:r>
+        <w:t>Linear Regression</w:t>
       </w:r>
       <w:bookmarkEnd w:id="5"/>
     </w:p>
     <w:p>
       <w:r>
-        <w:t>Regression models are suitable for this project because the target variabl</w:t>
-      </w:r>
-      <w:r>
-        <w:t xml:space="preserve">e </w:t>
-      </w:r>
-      <w:r>
-        <w:t>is a continuous numerical value measured in seconds.</w:t>
-      </w:r>
-    </w:p>
-    <w:p>
-      <w:r>
-        <w:t>I considered three possible regression models: Linear Regression, Random Forest Regressor and Gradient Boosting Regressor.</w:t>
-      </w:r>
-    </w:p>
-    <w:p>
-      <w:r>
-        <w:rPr>
-          <w:u w:val="single"/>
-        </w:rPr>
-        <w:t>Linear regression</w:t>
-      </w:r>
-      <w:r>
-        <w:rPr>
-          <w:u w:val="single"/>
-        </w:rPr>
+        <w:t xml:space="preserve">Linear regression is a simple and low computational complexity. The main problem in this model is its limits when relationships between features and lap time are nonlinear. </w:t>
+      </w:r>
+      <w:hyperlink r:id="rId6">
+        <w:r>
+          <w:rPr>
+            <w:color w:val="0563C1"/>
+            <w:u w:val="single"/>
+          </w:rPr>
+          <w:t>[1]</w:t>
+        </w:r>
+      </w:hyperlink>
+    </w:p>
+    <w:p>
+      <w:r>
+        <w:t>I already tried this model, but the result was not suitable for the solution I want to build. I will keep it as the initial reference, without selecting more standalone regression models. This result concerns my implementation. It does not prove all regression approaches are unsuitable for forecasting</w:t>
+      </w:r>
+      <w:r>
+        <w:t>, however I will not try to use them anymore as it is like using a fork to drink a soup.</w:t>
+      </w:r>
+    </w:p>
+    <w:p>
+      <w:pPr>
+        <w:pStyle w:val="Heading2"/>
+      </w:pPr>
+      <w:bookmarkStart w:id="6" w:name="_Toc241582156"/>
+      <w:r>
+        <w:t>Persistent Baseline</w:t>
+      </w:r>
+      <w:bookmarkEnd w:id="6"/>
+    </w:p>
+    <w:p>
+      <w:r>
+        <w:t xml:space="preserve">The persistence baseline predicts the next lap time using the last observed lap time. For example, after a lap of 90.2 seconds, it predicts 90.2 seconds for the following lap. It uses information already available at the end of the current lap. This is the main baseline the forecasting models should improve on. </w:t>
+      </w:r>
+      <w:hyperlink r:id="rId7">
+        <w:r>
+          <w:rPr>
+            <w:color w:val="0563C1"/>
+            <w:u w:val="single"/>
+          </w:rPr>
+          <w:t>[2]</w:t>
+        </w:r>
+      </w:hyperlink>
+    </w:p>
+    <w:p>
+      <w:pPr>
+        <w:pStyle w:val="Heading1"/>
+      </w:pPr>
+      <w:bookmarkStart w:id="7" w:name="_Toc241582157"/>
+      <w:r>
+        <w:lastRenderedPageBreak/>
+        <w:t>Time Series Forecasting Models</w:t>
+      </w:r>
+      <w:bookmarkEnd w:id="7"/>
+    </w:p>
+    <w:p>
+      <w:r>
+        <w:t xml:space="preserve">Formula 1 lap times are ordered in time and due to this, time-series forecasting models are useful for this prediction problem. I am considering ARIMA, SARIMAX, Exponential Smoothing and LSTM as possible approaches. </w:t>
+      </w:r>
+      <w:hyperlink r:id="rId8">
+        <w:r>
+          <w:rPr>
+            <w:color w:val="0563C1"/>
+            <w:u w:val="single"/>
+          </w:rPr>
+          <w:t>[3]</w:t>
+        </w:r>
+      </w:hyperlink>
+      <w:hyperlink r:id="rId9">
+        <w:r>
+          <w:rPr>
+            <w:color w:val="0563C1"/>
+            <w:u w:val="single"/>
+          </w:rPr>
+          <w:t>[5]</w:t>
+        </w:r>
+      </w:hyperlink>
+      <w:hyperlink r:id="rId10">
+        <w:r>
+          <w:rPr>
+            <w:color w:val="0563C1"/>
+            <w:u w:val="single"/>
+          </w:rPr>
+          <w:t>[7]</w:t>
+        </w:r>
+      </w:hyperlink>
+      <w:hyperlink r:id="rId11">
+        <w:r>
+          <w:rPr>
+            <w:color w:val="0563C1"/>
+            <w:u w:val="single"/>
+          </w:rPr>
+          <w:t>[8]</w:t>
+        </w:r>
+      </w:hyperlink>
+      <w:hyperlink r:id="rId12">
+        <w:r>
+          <w:rPr>
+            <w:color w:val="0563C1"/>
+            <w:u w:val="single"/>
+          </w:rPr>
+          <w:t>[9]</w:t>
+        </w:r>
+      </w:hyperlink>
+    </w:p>
+    <w:p>
+      <w:pPr>
+        <w:pStyle w:val="Heading2"/>
+      </w:pPr>
+      <w:bookmarkStart w:id="8" w:name="_Toc241582158"/>
+      <w:r>
+        <w:t>ARIMA</w:t>
+      </w:r>
+      <w:bookmarkEnd w:id="8"/>
+    </w:p>
+    <w:p>
+      <w:r>
+        <w:t>ARIMA models</w:t>
+      </w:r>
+      <w:r>
+        <w:t xml:space="preserve"> predict future values</w:t>
+      </w:r>
+      <w:r>
+        <w:t xml:space="preserve"> using previous observations</w:t>
+      </w:r>
+      <w:r>
+        <w:t xml:space="preserve"> and</w:t>
+      </w:r>
+      <w:r>
+        <w:t xml:space="preserve"> previous error. </w:t>
+      </w:r>
+      <w:r>
+        <w:t xml:space="preserve">It combines autoregression(p), differencing(d) and moving averages(q). </w:t>
+      </w:r>
+      <w:r>
+        <w:t xml:space="preserve">For this project, it would use previous lap times of a driver to predict the following lap time. It does not directly include external race features. </w:t>
+      </w:r>
+      <w:hyperlink r:id="rId13">
+        <w:r>
+          <w:rPr>
+            <w:color w:val="0563C1"/>
+            <w:u w:val="single"/>
+          </w:rPr>
+          <w:t>[3]</w:t>
+        </w:r>
+      </w:hyperlink>
+      <w:hyperlink r:id="rId14">
+        <w:r>
+          <w:rPr>
+            <w:color w:val="0563C1"/>
+            <w:u w:val="single"/>
+          </w:rPr>
+          <w:t>[4]</w:t>
+        </w:r>
+      </w:hyperlink>
+    </w:p>
+    <w:p>
+      <w:r>
+        <w:t xml:space="preserve">Autoregression (p) - Uses previous values of the time series to predict the next value. In </w:t>
+      </w:r>
+      <w:r>
+        <w:t>other words is the regression “parameter”.</w:t>
+      </w:r>
+    </w:p>
+    <w:p>
+      <w:r>
+        <w:t>Differencing (d) - Uses the differences between consecutive values instead of the original values to make the time series more stable. In this project, it would focus on how lap times change from one lap to another.</w:t>
+      </w:r>
+    </w:p>
+    <w:p>
+      <w:r>
+        <w:t>Moving Average (q) - Uses previous prediction errors to improve future predictions. If the model underestimated or overestimated previous lap times, those errors help adjust the prediction of the following lap.</w:t>
+      </w:r>
+    </w:p>
+    <w:p>
+      <w:pPr>
+        <w:pStyle w:val="Heading2"/>
+      </w:pPr>
+      <w:bookmarkStart w:id="9" w:name="_Toc241582159"/>
+      <w:r>
+        <w:t>ARIMA</w:t>
+      </w:r>
+      <w:r>
+        <w:t xml:space="preserve"> with external features using SARIMAX</w:t>
+      </w:r>
+      <w:bookmarkEnd w:id="9"/>
+    </w:p>
+    <w:p>
+      <w:r>
+        <w:t xml:space="preserve">SARIMAX extends ARIMA by including external variables such as tyre age, tyre compound, weather and track status. The model would </w:t>
+      </w:r>
+      <w:r>
+        <w:t>be more complex and maybe better to use, as it will take on more variables that are really useful and affect lap times.</w:t>
+      </w:r>
+      <w:hyperlink r:id="rId15">
+        <w:r>
+          <w:rPr>
+            <w:color w:val="0563C1"/>
+            <w:u w:val="single"/>
+          </w:rPr>
+          <w:t>[5]</w:t>
+        </w:r>
+      </w:hyperlink>
+      <w:hyperlink r:id="rId16">
+        <w:r>
+          <w:rPr>
+            <w:color w:val="0563C1"/>
+            <w:u w:val="single"/>
+          </w:rPr>
+          <w:t>[6]</w:t>
+        </w:r>
+      </w:hyperlink>
+    </w:p>
+    <w:p>
+      <w:r>
+        <w:t xml:space="preserve">I would use SARIMAX without seasonal terms, using seasonal_order=(0, 0, 0, 0), because Formula 1 lap times </w:t>
+      </w:r>
+      <w:r>
+        <w:t>are not seasonal. Different circuit and conditions, make this seasonality non-existent.</w:t>
+      </w:r>
+      <w:r>
+        <w:t xml:space="preserve"> The main limitation is that external variables must be available at the end of the current lap. </w:t>
+      </w:r>
+      <w:hyperlink r:id="rId17">
+        <w:r>
+          <w:rPr>
+            <w:color w:val="0563C1"/>
+            <w:u w:val="single"/>
+          </w:rPr>
+          <w:t>[6]</w:t>
+        </w:r>
+      </w:hyperlink>
+    </w:p>
+    <w:p>
+      <w:pPr>
+        <w:pStyle w:val="Heading2"/>
+      </w:pPr>
+      <w:bookmarkStart w:id="10" w:name="_Toc241582160"/>
+      <w:r>
+        <w:t>Exponential Smoothing</w:t>
+      </w:r>
+      <w:bookmarkEnd w:id="10"/>
+    </w:p>
+    <w:p>
+      <w:r>
+        <w:t>Exponential Smoothing gives more importance to recent observations when forecasting future values. It is simple and efficient, but it is less suitable for sudden changes caused by pit stops, Safety Cars or changing race conditions</w:t>
+      </w:r>
+      <w:r>
+        <w:t>, which makes it good as a project baseline, however for a final version, it would be underwhelming.</w:t>
+      </w:r>
+      <w:r>
         <w:t xml:space="preserve"> </w:t>
       </w:r>
-      <w:r>
-        <w:t xml:space="preserve">is a simple and low computational complexity. The main problem in this model is </w:t>
-      </w:r>
-      <w:r>
-        <w:t>its limits when relationships between features and lap time are nonlinear.</w:t>
-      </w:r>
-      <w:r>
-        <w:t xml:space="preserve"> [1]</w:t>
-      </w:r>
-    </w:p>
-    <w:p>
-      <w:r>
-        <w:rPr>
-          <w:u w:val="single"/>
-        </w:rPr>
-        <w:t>Random Forest Regressor</w:t>
-      </w:r>
-      <w:r>
-        <w:t xml:space="preserve"> combines multiple decision trees and it is better on nonlinear relationships between features. Its main problem is lower interpretability compared to linear regression. [2]</w:t>
-      </w:r>
-    </w:p>
-    <w:p>
-      <w:r>
-        <w:rPr>
-          <w:u w:val="single"/>
-        </w:rPr>
-        <w:t>Gradient Boosting Regressor</w:t>
-      </w:r>
-      <w:r>
-        <w:t xml:space="preserve"> builds decision trees sequentially and fixes previous errors. It handles really well complex relationships but requires more tuning and has a higher risk of overfitting. [3]</w:t>
+      <w:hyperlink r:id="rId18">
+        <w:r>
+          <w:rPr>
+            <w:color w:val="0563C1"/>
+            <w:u w:val="single"/>
+          </w:rPr>
+          <w:t>[7]</w:t>
+        </w:r>
+      </w:hyperlink>
+      <w:hyperlink r:id="rId19">
+        <w:r>
+          <w:rPr>
+            <w:color w:val="0563C1"/>
+            <w:u w:val="single"/>
+          </w:rPr>
+          <w:t>[8]</w:t>
+        </w:r>
+      </w:hyperlink>
+    </w:p>
+    <w:p>
+      <w:r>
+        <w:t>For this project, it can be good, as it will look more and more to the last laps and evaluate driver’s pace, however, previous/old lap times can give a lot of information on the overall performance and maybe create an optimal model</w:t>
+      </w:r>
+      <w:r>
+        <w:t xml:space="preserve">. </w:t>
+      </w:r>
+      <w:hyperlink r:id="rId20">
+        <w:r>
+          <w:rPr>
+            <w:color w:val="0563C1"/>
+            <w:u w:val="single"/>
+          </w:rPr>
+          <w:t>[7]</w:t>
+        </w:r>
+      </w:hyperlink>
+      <w:hyperlink r:id="rId21">
+        <w:r>
+          <w:rPr>
+            <w:color w:val="0563C1"/>
+            <w:u w:val="single"/>
+          </w:rPr>
+          <w:t>[8]</w:t>
+        </w:r>
+      </w:hyperlink>
+    </w:p>
+    <w:p>
+      <w:pPr>
+        <w:pStyle w:val="Heading2"/>
+      </w:pPr>
+      <w:bookmarkStart w:id="11" w:name="_Toc241582161"/>
+      <w:r>
+        <w:lastRenderedPageBreak/>
+        <w:t>LSTM as an extension</w:t>
+      </w:r>
+      <w:bookmarkEnd w:id="11"/>
+    </w:p>
+    <w:p>
+      <w:r>
+        <w:t xml:space="preserve">LSTM is a recurrent neural network which learns from sequences. It would receive previous laps and race features to predict the next lap time. Its main limitations are the data requirements, tuning, training time and overfitting. It will remain an optional extension after the simpler models. </w:t>
+      </w:r>
+      <w:hyperlink r:id="rId22">
+        <w:r>
+          <w:rPr>
+            <w:color w:val="0563C1"/>
+            <w:u w:val="single"/>
+          </w:rPr>
+          <w:t>[9]</w:t>
+        </w:r>
+      </w:hyperlink>
+    </w:p>
+    <w:p>
+      <w:r>
+        <w:t>LSTM will only be considered after the simpler forecasting models because its complexity does not guarantee a better result.</w:t>
       </w:r>
     </w:p>
     <w:p>
       <w:pPr>
         <w:pStyle w:val="Heading3"/>
       </w:pPr>
-      <w:bookmarkStart w:id="6" w:name="_Toc241156825"/>
+      <w:bookmarkStart w:id="12" w:name="_Toc241582162"/>
       <w:r>
         <w:t>Model Comparison</w:t>
       </w:r>
-      <w:bookmarkEnd w:id="6"/>
+      <w:bookmarkEnd w:id="12"/>
     </w:p>
     <w:tbl>
       <w:tblPr>
-        <w:tblW w:w="0" w:type="auto"/>
+        <w:tblW w:w="9660" w:type="dxa"/>
         <w:tblCellSpacing w:w="15" w:type="dxa"/>
+        <w:tblInd w:w="-328" w:type="dxa"/>
         <w:tblBorders>
           <w:top w:val="single" w:sz="4" w:space="0" w:color="auto"/>
           <w:left w:val="single" w:sz="4" w:space="0" w:color="auto"/>
@@ -1045,33 +1759,31 @@
         <w:tblLook w:val="04A0" w:firstRow="1" w:lastRow="0" w:firstColumn="1" w:lastColumn="0" w:noHBand="0" w:noVBand="1"/>
       </w:tblPr>
       <w:tblGrid>
-        <w:gridCol w:w="2494"/>
-        <w:gridCol w:w="2179"/>
-        <w:gridCol w:w="1985"/>
-        <w:gridCol w:w="2126"/>
+        <w:gridCol w:w="1892"/>
+        <w:gridCol w:w="1695"/>
+        <w:gridCol w:w="1704"/>
+        <w:gridCol w:w="2448"/>
+        <w:gridCol w:w="1921"/>
       </w:tblGrid>
       <w:tr>
         <w:trPr>
+          <w:trHeight w:val="337"/>
           <w:tblHeader/>
           <w:tblCellSpacing w:w="15" w:type="dxa"/>
         </w:trPr>
         <w:tc>
           <w:tcPr>
-            <w:tcW w:w="0" w:type="auto"/>
+            <w:tcW w:w="1847" w:type="dxa"/>
             <w:vAlign w:val="center"/>
             <w:hideMark/>
           </w:tcPr>
           <w:p>
             <w:pPr>
-              <w:rPr>
-                <w:b/>
-                <w:bCs/>
-              </w:rPr>
+              <w:spacing w:after="0" w:line="240" w:lineRule="auto"/>
             </w:pPr>
             <w:r>
               <w:rPr>
-                <w:b/>
-                <w:bCs/>
+                <w:sz w:val="18"/>
               </w:rPr>
               <w:t>Criterion</w:t>
             </w:r>
@@ -1079,119 +1791,168 @@
         </w:tc>
         <w:tc>
           <w:tcPr>
-            <w:tcW w:w="2149" w:type="dxa"/>
+            <w:tcW w:w="1665" w:type="dxa"/>
             <w:vAlign w:val="center"/>
             <w:hideMark/>
           </w:tcPr>
           <w:p>
             <w:pPr>
-              <w:rPr>
-                <w:b/>
-                <w:bCs/>
-              </w:rPr>
+              <w:spacing w:after="0" w:line="240" w:lineRule="auto"/>
             </w:pPr>
             <w:r>
               <w:rPr>
-                <w:b/>
-                <w:bCs/>
-              </w:rPr>
-              <w:t>Linear Regression</w:t>
+                <w:sz w:val="18"/>
+              </w:rPr>
+              <w:t>ARIMA</w:t>
             </w:r>
           </w:p>
         </w:tc>
         <w:tc>
           <w:tcPr>
-            <w:tcW w:w="1955" w:type="dxa"/>
+            <w:tcW w:w="1674" w:type="dxa"/>
             <w:vAlign w:val="center"/>
             <w:hideMark/>
           </w:tcPr>
           <w:p>
             <w:pPr>
-              <w:rPr>
-                <w:b/>
-                <w:bCs/>
-              </w:rPr>
+              <w:spacing w:after="0" w:line="240" w:lineRule="auto"/>
             </w:pPr>
             <w:r>
               <w:rPr>
-                <w:b/>
-                <w:bCs/>
-              </w:rPr>
-              <w:t>Random Forest</w:t>
+                <w:sz w:val="18"/>
+              </w:rPr>
+              <w:t>SARIMAX</w:t>
             </w:r>
           </w:p>
         </w:tc>
         <w:tc>
           <w:tcPr>
-            <w:tcW w:w="2081" w:type="dxa"/>
+            <w:tcW w:w="2418" w:type="dxa"/>
             <w:vAlign w:val="center"/>
             <w:hideMark/>
           </w:tcPr>
           <w:p>
             <w:pPr>
-              <w:rPr>
-                <w:b/>
-                <w:bCs/>
-              </w:rPr>
+              <w:spacing w:after="0" w:line="240" w:lineRule="auto"/>
             </w:pPr>
             <w:r>
               <w:rPr>
-                <w:b/>
-                <w:bCs/>
-              </w:rPr>
-              <w:t>Gradient Boosting</w:t>
+                <w:sz w:val="18"/>
+              </w:rPr>
+              <w:t>Exponential Smoothing</w:t>
+            </w:r>
+          </w:p>
+        </w:tc>
+        <w:tc>
+          <w:tcPr>
+            <w:tcW w:w="1876" w:type="dxa"/>
+            <w:vAlign w:val="center"/>
+            <w:hideMark/>
+          </w:tcPr>
+          <w:p>
+            <w:pPr>
+              <w:spacing w:after="0" w:line="240" w:lineRule="auto"/>
+            </w:pPr>
+            <w:r>
+              <w:rPr>
+                <w:sz w:val="18"/>
+              </w:rPr>
+              <w:t>LSTM</w:t>
             </w:r>
           </w:p>
         </w:tc>
       </w:tr>
       <w:tr>
         <w:trPr>
+          <w:trHeight w:val="657"/>
           <w:tblCellSpacing w:w="15" w:type="dxa"/>
         </w:trPr>
         <w:tc>
           <w:tcPr>
-            <w:tcW w:w="0" w:type="auto"/>
+            <w:tcW w:w="1847" w:type="dxa"/>
             <w:vAlign w:val="center"/>
             <w:hideMark/>
           </w:tcPr>
           <w:p>
-            <w:r>
-              <w:t>Nonlinear relations</w:t>
+            <w:pPr>
+              <w:spacing w:after="0" w:line="240" w:lineRule="auto"/>
+            </w:pPr>
+            <w:r>
+              <w:rPr>
+                <w:sz w:val="18"/>
+              </w:rPr>
+              <w:t>Uses previous lap times</w:t>
             </w:r>
           </w:p>
         </w:tc>
         <w:tc>
           <w:tcPr>
-            <w:tcW w:w="2149" w:type="dxa"/>
+            <w:tcW w:w="1665" w:type="dxa"/>
             <w:vAlign w:val="center"/>
             <w:hideMark/>
           </w:tcPr>
           <w:p>
-            <w:r>
-              <w:t>No</w:t>
+            <w:pPr>
+              <w:spacing w:after="0" w:line="240" w:lineRule="auto"/>
+            </w:pPr>
+            <w:r>
+              <w:rPr>
+                <w:sz w:val="18"/>
+              </w:rPr>
+              <w:t>Yes</w:t>
             </w:r>
           </w:p>
         </w:tc>
         <w:tc>
           <w:tcPr>
-            <w:tcW w:w="1955" w:type="dxa"/>
+            <w:tcW w:w="1674" w:type="dxa"/>
             <w:vAlign w:val="center"/>
             <w:hideMark/>
           </w:tcPr>
           <w:p>
-            <w:r>
+            <w:pPr>
+              <w:spacing w:after="0" w:line="240" w:lineRule="auto"/>
+            </w:pPr>
+            <w:r>
+              <w:rPr>
+                <w:sz w:val="18"/>
+              </w:rPr>
               <w:t>Yes</w:t>
             </w:r>
           </w:p>
         </w:tc>
         <w:tc>
           <w:tcPr>
-            <w:tcW w:w="2081" w:type="dxa"/>
+            <w:tcW w:w="2418" w:type="dxa"/>
             <w:vAlign w:val="center"/>
             <w:hideMark/>
           </w:tcPr>
           <w:p>
-            <w:r>
+            <w:pPr>
+              <w:spacing w:after="0" w:line="240" w:lineRule="auto"/>
+            </w:pPr>
+            <w:r>
+              <w:rPr>
+                <w:sz w:val="18"/>
+              </w:rPr>
+              <w:t>Yes</w:t>
+            </w:r>
+          </w:p>
+        </w:tc>
+        <w:tc>
+          <w:tcPr>
+            <w:tcW w:w="1876" w:type="dxa"/>
+            <w:vAlign w:val="center"/>
+            <w:hideMark/>
+          </w:tcPr>
+          <w:p>
+            <w:pPr>
+              <w:spacing w:after="0" w:line="240" w:lineRule="auto"/>
+            </w:pPr>
+            <w:r>
+              <w:rPr>
+                <w:sz w:val="18"/>
+              </w:rPr>
               <w:t>Yes</w:t>
             </w:r>
           </w:p>
@@ -1199,52 +1960,95 @@
       </w:tr>
       <w:tr>
         <w:trPr>
+          <w:trHeight w:val="337"/>
           <w:tblCellSpacing w:w="15" w:type="dxa"/>
         </w:trPr>
         <w:tc>
           <w:tcPr>
-            <w:tcW w:w="0" w:type="auto"/>
+            <w:tcW w:w="1847" w:type="dxa"/>
             <w:vAlign w:val="center"/>
             <w:hideMark/>
           </w:tcPr>
           <w:p>
-            <w:r>
+            <w:pPr>
+              <w:spacing w:after="0" w:line="240" w:lineRule="auto"/>
+            </w:pPr>
+            <w:r>
+              <w:rPr>
+                <w:sz w:val="18"/>
+              </w:rPr>
               <w:t>External features</w:t>
             </w:r>
           </w:p>
         </w:tc>
         <w:tc>
           <w:tcPr>
-            <w:tcW w:w="2149" w:type="dxa"/>
+            <w:tcW w:w="1665" w:type="dxa"/>
             <w:vAlign w:val="center"/>
             <w:hideMark/>
           </w:tcPr>
           <w:p>
-            <w:r>
-              <w:t>Yes</w:t>
+            <w:pPr>
+              <w:spacing w:after="0" w:line="240" w:lineRule="auto"/>
+            </w:pPr>
+            <w:r>
+              <w:rPr>
+                <w:sz w:val="18"/>
+              </w:rPr>
+              <w:t>No</w:t>
             </w:r>
           </w:p>
         </w:tc>
         <w:tc>
           <w:tcPr>
-            <w:tcW w:w="1955" w:type="dxa"/>
+            <w:tcW w:w="1674" w:type="dxa"/>
             <w:vAlign w:val="center"/>
             <w:hideMark/>
           </w:tcPr>
           <w:p>
-            <w:r>
+            <w:pPr>
+              <w:spacing w:after="0" w:line="240" w:lineRule="auto"/>
+            </w:pPr>
+            <w:r>
+              <w:rPr>
+                <w:sz w:val="18"/>
+              </w:rPr>
               <w:t>Yes</w:t>
             </w:r>
           </w:p>
         </w:tc>
         <w:tc>
           <w:tcPr>
-            <w:tcW w:w="2081" w:type="dxa"/>
+            <w:tcW w:w="2418" w:type="dxa"/>
             <w:vAlign w:val="center"/>
             <w:hideMark/>
           </w:tcPr>
           <w:p>
-            <w:r>
+            <w:pPr>
+              <w:spacing w:after="0" w:line="240" w:lineRule="auto"/>
+            </w:pPr>
+            <w:r>
+              <w:rPr>
+                <w:sz w:val="18"/>
+              </w:rPr>
+              <w:t>No</w:t>
+            </w:r>
+          </w:p>
+        </w:tc>
+        <w:tc>
+          <w:tcPr>
+            <w:tcW w:w="1876" w:type="dxa"/>
+            <w:vAlign w:val="center"/>
+            <w:hideMark/>
+          </w:tcPr>
+          <w:p>
+            <w:pPr>
+              <w:spacing w:after="0" w:line="240" w:lineRule="auto"/>
+            </w:pPr>
+            <w:r>
+              <w:rPr>
+                <w:sz w:val="18"/>
+              </w:rPr>
               <w:t>Yes</w:t>
             </w:r>
           </w:p>
@@ -1252,160 +2056,288 @@
       </w:tr>
       <w:tr>
         <w:trPr>
+          <w:trHeight w:val="675"/>
           <w:tblCellSpacing w:w="15" w:type="dxa"/>
         </w:trPr>
         <w:tc>
           <w:tcPr>
-            <w:tcW w:w="0" w:type="auto"/>
+            <w:tcW w:w="1847" w:type="dxa"/>
             <w:vAlign w:val="center"/>
             <w:hideMark/>
           </w:tcPr>
           <w:p>
-            <w:r>
-              <w:t>Interpretability</w:t>
+            <w:pPr>
+              <w:spacing w:after="0" w:line="240" w:lineRule="auto"/>
+            </w:pPr>
+            <w:r>
+              <w:rPr>
+                <w:sz w:val="18"/>
+              </w:rPr>
+              <w:t>Handles time dependency</w:t>
             </w:r>
           </w:p>
         </w:tc>
         <w:tc>
           <w:tcPr>
-            <w:tcW w:w="2149" w:type="dxa"/>
+            <w:tcW w:w="1665" w:type="dxa"/>
             <w:vAlign w:val="center"/>
             <w:hideMark/>
           </w:tcPr>
           <w:p>
-            <w:r>
-              <w:t>High</w:t>
+            <w:pPr>
+              <w:spacing w:after="0" w:line="240" w:lineRule="auto"/>
+            </w:pPr>
+            <w:r>
+              <w:rPr>
+                <w:sz w:val="18"/>
+              </w:rPr>
+              <w:t>Strong</w:t>
             </w:r>
           </w:p>
         </w:tc>
         <w:tc>
           <w:tcPr>
-            <w:tcW w:w="1955" w:type="dxa"/>
+            <w:tcW w:w="1674" w:type="dxa"/>
             <w:vAlign w:val="center"/>
             <w:hideMark/>
           </w:tcPr>
           <w:p>
-            <w:r>
-              <w:t>Medium</w:t>
+            <w:pPr>
+              <w:spacing w:after="0" w:line="240" w:lineRule="auto"/>
+            </w:pPr>
+            <w:r>
+              <w:rPr>
+                <w:sz w:val="18"/>
+              </w:rPr>
+              <w:t>Strong</w:t>
             </w:r>
           </w:p>
         </w:tc>
         <w:tc>
           <w:tcPr>
-            <w:tcW w:w="2081" w:type="dxa"/>
+            <w:tcW w:w="2418" w:type="dxa"/>
             <w:vAlign w:val="center"/>
             <w:hideMark/>
           </w:tcPr>
           <w:p>
-            <w:r>
-              <w:t>Medium</w:t>
+            <w:pPr>
+              <w:spacing w:after="0" w:line="240" w:lineRule="auto"/>
+            </w:pPr>
+            <w:r>
+              <w:rPr>
+                <w:sz w:val="18"/>
+              </w:rPr>
+              <w:t>Strong</w:t>
+            </w:r>
+          </w:p>
+        </w:tc>
+        <w:tc>
+          <w:tcPr>
+            <w:tcW w:w="1876" w:type="dxa"/>
+            <w:vAlign w:val="center"/>
+            <w:hideMark/>
+          </w:tcPr>
+          <w:p>
+            <w:pPr>
+              <w:spacing w:after="0" w:line="240" w:lineRule="auto"/>
+            </w:pPr>
+            <w:r>
+              <w:rPr>
+                <w:sz w:val="18"/>
+              </w:rPr>
+              <w:t>Strong</w:t>
             </w:r>
           </w:p>
         </w:tc>
       </w:tr>
       <w:tr>
         <w:trPr>
+          <w:trHeight w:val="337"/>
           <w:tblCellSpacing w:w="15" w:type="dxa"/>
         </w:trPr>
         <w:tc>
           <w:tcPr>
-            <w:tcW w:w="0" w:type="auto"/>
+            <w:tcW w:w="1847" w:type="dxa"/>
             <w:vAlign w:val="center"/>
             <w:hideMark/>
           </w:tcPr>
           <w:p>
-            <w:r>
-              <w:lastRenderedPageBreak/>
+            <w:pPr>
+              <w:spacing w:after="0" w:line="240" w:lineRule="auto"/>
+            </w:pPr>
+            <w:r>
+              <w:rPr>
+                <w:sz w:val="18"/>
+              </w:rPr>
               <w:t>Complexity</w:t>
             </w:r>
           </w:p>
         </w:tc>
         <w:tc>
           <w:tcPr>
-            <w:tcW w:w="2149" w:type="dxa"/>
+            <w:tcW w:w="1665" w:type="dxa"/>
             <w:vAlign w:val="center"/>
             <w:hideMark/>
           </w:tcPr>
           <w:p>
-            <w:r>
-              <w:t>Low</w:t>
+            <w:pPr>
+              <w:spacing w:after="0" w:line="240" w:lineRule="auto"/>
+            </w:pPr>
+            <w:r>
+              <w:rPr>
+                <w:sz w:val="18"/>
+              </w:rPr>
+              <w:t>Medium</w:t>
             </w:r>
           </w:p>
         </w:tc>
         <w:tc>
           <w:tcPr>
-            <w:tcW w:w="1955" w:type="dxa"/>
+            <w:tcW w:w="1674" w:type="dxa"/>
             <w:vAlign w:val="center"/>
             <w:hideMark/>
           </w:tcPr>
           <w:p>
-            <w:r>
-              <w:t>Medium</w:t>
+            <w:pPr>
+              <w:spacing w:after="0" w:line="240" w:lineRule="auto"/>
+            </w:pPr>
+            <w:r>
+              <w:rPr>
+                <w:sz w:val="18"/>
+              </w:rPr>
+              <w:t>High</w:t>
             </w:r>
           </w:p>
         </w:tc>
         <w:tc>
           <w:tcPr>
-            <w:tcW w:w="2081" w:type="dxa"/>
+            <w:tcW w:w="2418" w:type="dxa"/>
             <w:vAlign w:val="center"/>
             <w:hideMark/>
           </w:tcPr>
           <w:p>
-            <w:r>
-              <w:t>Medium</w:t>
+            <w:pPr>
+              <w:spacing w:after="0" w:line="240" w:lineRule="auto"/>
+            </w:pPr>
+            <w:r>
+              <w:rPr>
+                <w:sz w:val="18"/>
+              </w:rPr>
+              <w:t>Low</w:t>
+            </w:r>
+          </w:p>
+        </w:tc>
+        <w:tc>
+          <w:tcPr>
+            <w:tcW w:w="1876" w:type="dxa"/>
+            <w:vAlign w:val="center"/>
+            <w:hideMark/>
+          </w:tcPr>
+          <w:p>
+            <w:pPr>
+              <w:spacing w:after="0" w:line="240" w:lineRule="auto"/>
+            </w:pPr>
+            <w:r>
+              <w:rPr>
+                <w:sz w:val="18"/>
+              </w:rPr>
+              <w:t>High</w:t>
             </w:r>
           </w:p>
         </w:tc>
       </w:tr>
       <w:tr>
         <w:trPr>
+          <w:trHeight w:val="657"/>
           <w:tblCellSpacing w:w="15" w:type="dxa"/>
         </w:trPr>
         <w:tc>
           <w:tcPr>
-            <w:tcW w:w="0" w:type="auto"/>
+            <w:tcW w:w="1847" w:type="dxa"/>
             <w:vAlign w:val="center"/>
             <w:hideMark/>
           </w:tcPr>
           <w:p>
-            <w:r>
-              <w:t>Suitable for this project</w:t>
+            <w:pPr>
+              <w:spacing w:after="0" w:line="240" w:lineRule="auto"/>
+            </w:pPr>
+            <w:r>
+              <w:rPr>
+                <w:sz w:val="18"/>
+              </w:rPr>
+              <w:t>Handles sudden race changes</w:t>
             </w:r>
           </w:p>
         </w:tc>
         <w:tc>
           <w:tcPr>
-            <w:tcW w:w="2149" w:type="dxa"/>
+            <w:tcW w:w="1665" w:type="dxa"/>
             <w:vAlign w:val="center"/>
             <w:hideMark/>
           </w:tcPr>
           <w:p>
-            <w:r>
-              <w:t>Yes</w:t>
+            <w:pPr>
+              <w:spacing w:after="0" w:line="240" w:lineRule="auto"/>
+            </w:pPr>
+            <w:r>
+              <w:rPr>
+                <w:sz w:val="18"/>
+              </w:rPr>
+              <w:t>Limited</w:t>
             </w:r>
           </w:p>
         </w:tc>
         <w:tc>
           <w:tcPr>
-            <w:tcW w:w="1955" w:type="dxa"/>
+            <w:tcW w:w="1674" w:type="dxa"/>
             <w:vAlign w:val="center"/>
             <w:hideMark/>
           </w:tcPr>
           <w:p>
-            <w:r>
-              <w:t>Yes</w:t>
+            <w:pPr>
+              <w:spacing w:after="0" w:line="240" w:lineRule="auto"/>
+            </w:pPr>
+            <w:r>
+              <w:rPr>
+                <w:sz w:val="18"/>
+              </w:rPr>
+              <w:t>Medium</w:t>
             </w:r>
           </w:p>
         </w:tc>
         <w:tc>
           <w:tcPr>
-            <w:tcW w:w="2081" w:type="dxa"/>
+            <w:tcW w:w="2418" w:type="dxa"/>
             <w:vAlign w:val="center"/>
             <w:hideMark/>
           </w:tcPr>
           <w:p>
-            <w:r>
-              <w:t>Yes</w:t>
+            <w:pPr>
+              <w:spacing w:after="0" w:line="240" w:lineRule="auto"/>
+            </w:pPr>
+            <w:r>
+              <w:rPr>
+                <w:sz w:val="18"/>
+              </w:rPr>
+              <w:t>Limited</w:t>
+            </w:r>
+          </w:p>
+        </w:tc>
+        <w:tc>
+          <w:tcPr>
+            <w:tcW w:w="1876" w:type="dxa"/>
+            <w:vAlign w:val="center"/>
+            <w:hideMark/>
+          </w:tcPr>
+          <w:p>
+            <w:pPr>
+              <w:spacing w:after="0" w:line="240" w:lineRule="auto"/>
+            </w:pPr>
+            <w:r>
+              <w:rPr>
+                <w:sz w:val="18"/>
+              </w:rPr>
+              <w:t>Depends on inputs</w:t>
             </w:r>
           </w:p>
         </w:tc>
@@ -1414,700 +2346,189 @@
     <w:p/>
     <w:p>
       <w:r>
-        <w:t>Based on this comparison and the research, I am choosing Linear Regression and Gradient Boosting as the regression models for this challenge. Linear regression works well as a baseline and reference model, while Gradient Boosting provides a more complex model in which I can also work in understanding overfitting and how to fix it. [1][3]</w:t>
-      </w:r>
+        <w:t>Based on the comparison, ARIMA, SARIMAX and Exponential Smoothing will be tested. SARIMAX is the main candidate because it combines temporal information with external race features</w:t>
+      </w:r>
+      <w:r>
+        <w:t>, however</w:t>
+      </w:r>
+      <w:r>
+        <w:t xml:space="preserve"> </w:t>
+      </w:r>
+      <w:r>
+        <w:t>t</w:t>
+      </w:r>
+      <w:r>
+        <w:t xml:space="preserve">he final choice will depend on the validation results. </w:t>
+      </w:r>
+      <w:hyperlink r:id="rId23">
+        <w:r>
+          <w:rPr>
+            <w:color w:val="0563C1"/>
+            <w:u w:val="single"/>
+          </w:rPr>
+          <w:t>[3]</w:t>
+        </w:r>
+      </w:hyperlink>
+      <w:hyperlink r:id="rId24">
+        <w:r>
+          <w:rPr>
+            <w:color w:val="0563C1"/>
+            <w:u w:val="single"/>
+          </w:rPr>
+          <w:t>[5]</w:t>
+        </w:r>
+      </w:hyperlink>
+      <w:hyperlink r:id="rId25">
+        <w:r>
+          <w:rPr>
+            <w:color w:val="0563C1"/>
+            <w:u w:val="single"/>
+          </w:rPr>
+          <w:t>[7]</w:t>
+        </w:r>
+      </w:hyperlink>
+    </w:p>
+    <w:p>
+      <w:r>
+        <w:t xml:space="preserve">The selection at this stage is based on the characteristics and suitability of the models for the problem. Their actual predictive performance will be evaluated during the Realising phase. </w:t>
+      </w:r>
+      <w:hyperlink r:id="rId26">
+        <w:r>
+          <w:rPr>
+            <w:color w:val="0563C1"/>
+            <w:u w:val="single"/>
+          </w:rPr>
+          <w:t>[11]</w:t>
+        </w:r>
+      </w:hyperlink>
+    </w:p>
+    <w:p>
+      <w:pPr>
+        <w:pStyle w:val="Heading1"/>
+      </w:pPr>
+      <w:bookmarkStart w:id="13" w:name="_Toc241582163"/>
+      <w:r>
+        <w:t>Forecasting Setup</w:t>
+      </w:r>
+      <w:bookmarkEnd w:id="13"/>
+    </w:p>
+    <w:p>
+      <w:r>
+        <w:t>The forecast will be made at the end of lap t for lap t+1. I will organise the data by race, driver and lap number. I will not join different drivers or races into one continuous series.</w:t>
+      </w:r>
+    </w:p>
+    <w:p>
+      <w:r>
+        <w:t xml:space="preserve">For SARIMAX, features observed by the end of lap t will be aligned with the target at lap t+1. Possible inputs include tyre compound, tyre age, track status and the latest available weather observation. Information from lap t+1 must not enter the prediction. </w:t>
+      </w:r>
+      <w:hyperlink r:id="rId27">
+        <w:r>
+          <w:rPr>
+            <w:color w:val="0563C1"/>
+            <w:u w:val="single"/>
+          </w:rPr>
+          <w:t>[10]</w:t>
+        </w:r>
+      </w:hyperlink>
+    </w:p>
+    <w:p>
+      <w:r>
+        <w:lastRenderedPageBreak/>
+        <w:t>Missing or excluded laps will keep their original positions. I will document whether excluded laps become missing observations or start a new sequence, and report the percentage of laps covered.</w:t>
+      </w:r>
+    </w:p>
+    <w:p>
+      <w:pPr>
+        <w:pStyle w:val="Heading1"/>
+      </w:pPr>
+      <w:bookmarkStart w:id="14" w:name="_Toc241582164"/>
+      <w:r>
+        <w:t>Model Evaluation</w:t>
+      </w:r>
+      <w:bookmarkEnd w:id="14"/>
+    </w:p>
+    <w:p>
+      <w:r>
+        <w:t xml:space="preserve">I will use 2022 and 2023 for development and training, 2024 for validation and 2025 for the final test. Evaluation will move forward one lap at a time, using only information available before each prediction. </w:t>
+      </w:r>
+      <w:hyperlink r:id="rId28">
+        <w:r>
+          <w:rPr>
+            <w:color w:val="0563C1"/>
+            <w:u w:val="single"/>
+          </w:rPr>
+          <w:t>[11]</w:t>
+        </w:r>
+      </w:hyperlink>
+    </w:p>
+    <w:p>
+      <w:r>
+        <w:t>For ARIMA, SARIMAX and Exponential Smoothing, fitting will use only the observed part of each driver's race. Early laps without enough history will use persistence and will be reported separately. All models will be compared on the same target laps.</w:t>
+      </w:r>
+    </w:p>
+    <w:p>
+      <w:r>
+        <w:t xml:space="preserve">MAE in seconds will be the main metric, with RMSE to give more weight to large errors. I will compare all models with persistence and report overall and per-race results. </w:t>
+      </w:r>
+      <w:hyperlink r:id="rId29">
+        <w:r>
+          <w:rPr>
+            <w:color w:val="0563C1"/>
+            <w:u w:val="single"/>
+          </w:rPr>
+          <w:t>[12]</w:t>
+        </w:r>
+      </w:hyperlink>
+    </w:p>
+    <w:p>
+      <w:pPr>
+        <w:pStyle w:val="Heading1"/>
+      </w:pPr>
+      <w:bookmarkStart w:id="15" w:name="_Toc241582165"/>
+      <w:r>
+        <w:t>Conclusion</w:t>
+      </w:r>
+      <w:bookmarkEnd w:id="15"/>
+    </w:p>
+    <w:p>
+      <w:r>
+        <w:t>To sum up, the models selected for testing are Linear Regression, ARIMA, SARIMAX and Exponential Smoothing. LSTM remains an optional extension and persistence remains the baseline.</w:t>
+      </w:r>
+    </w:p>
+    <w:p>
+      <w:r>
+        <w:t>These models represent different possibilities, possible different results and approaches. They will be tested metric wise, but also how good are they for real-life scenarios and changes, to use one of them as the final version of this challenge.</w:t>
+      </w:r>
+    </w:p>
+    <w:p>
+      <w:r>
+        <w:t xml:space="preserve">The selection at this stage is based on the characteristics and suitability of the models for the problem. Their actual predictive performance will be evaluated during the Realising phase. </w:t>
+      </w:r>
+      <w:hyperlink r:id="rId30">
+        <w:r>
+          <w:rPr>
+            <w:color w:val="0563C1"/>
+            <w:u w:val="single"/>
+          </w:rPr>
+          <w:t>[11]</w:t>
+        </w:r>
+      </w:hyperlink>
     </w:p>
     <w:p>
       <w:pPr>
         <w:pStyle w:val="Heading2"/>
       </w:pPr>
-      <w:bookmarkStart w:id="7" w:name="_Toc241156826"/>
-      <w:r>
-        <w:t>Time Series Forecasting Models</w:t>
-      </w:r>
-      <w:bookmarkEnd w:id="7"/>
-    </w:p>
-    <w:p>
-      <w:r>
-        <w:t>Formula 1 lap times are ordered in time and due to this, time-series forecasting models are also useful for this prediction problem. I analysed three possible approaches using ARIMA, ARIMAX/SARIMAX and Exponential Smoothing. [4][6]</w:t>
-      </w:r>
-    </w:p>
-    <w:p>
-      <w:r>
-        <w:rPr>
-          <w:u w:val="single"/>
-        </w:rPr>
-        <w:t>ARIMA</w:t>
-      </w:r>
-      <w:r>
-        <w:t xml:space="preserve"> is the simplest model and fits time-dependant data really well, however it does not fit external race features such as weather or tyre degradation. [4]</w:t>
-      </w:r>
-    </w:p>
-    <w:p>
-      <w:r>
-        <w:t xml:space="preserve">On the other hand, </w:t>
-      </w:r>
-      <w:r>
-        <w:rPr>
-          <w:u w:val="single"/>
-        </w:rPr>
-        <w:t>SARIMAX</w:t>
-      </w:r>
-      <w:r>
-        <w:t xml:space="preserve"> improves this problem, while being more flexible for formula 1 data. The main problem in it is that it is more complex to configure and requires external variables to be available when making the prediction. [5]</w:t>
-      </w:r>
-    </w:p>
-    <w:p>
-      <w:r>
-        <w:rPr>
-          <w:u w:val="single"/>
-        </w:rPr>
-        <w:t>Exponential Smoothing</w:t>
-      </w:r>
-      <w:r>
-        <w:t xml:space="preserve"> gives more importance to recent observations when forecasting future values. It is simple and efficient, but it is less suitable for sudden changes caused by pit stops, Safety Cars or changing race conditions.</w:t>
-      </w:r>
-      <w:r>
-        <w:t xml:space="preserve"> [6]</w:t>
-      </w:r>
-    </w:p>
-    <w:p>
-      <w:pPr>
-        <w:pStyle w:val="Heading3"/>
-      </w:pPr>
-      <w:bookmarkStart w:id="8" w:name="_Toc241156827"/>
-      <w:r>
-        <w:t>Model Comparison</w:t>
-      </w:r>
-      <w:bookmarkEnd w:id="8"/>
-    </w:p>
-    <w:tbl>
-      <w:tblPr>
-        <w:tblW w:w="0" w:type="auto"/>
-        <w:tblCellSpacing w:w="15" w:type="dxa"/>
-        <w:tblBorders>
-          <w:top w:val="single" w:sz="4" w:space="0" w:color="auto"/>
-          <w:left w:val="single" w:sz="4" w:space="0" w:color="auto"/>
-          <w:bottom w:val="single" w:sz="4" w:space="0" w:color="auto"/>
-          <w:right w:val="single" w:sz="4" w:space="0" w:color="auto"/>
-          <w:insideH w:val="single" w:sz="4" w:space="0" w:color="auto"/>
-          <w:insideV w:val="single" w:sz="4" w:space="0" w:color="auto"/>
-        </w:tblBorders>
-        <w:tblCellMar>
-          <w:top w:w="15" w:type="dxa"/>
-          <w:left w:w="15" w:type="dxa"/>
-          <w:bottom w:w="15" w:type="dxa"/>
-          <w:right w:w="15" w:type="dxa"/>
-        </w:tblCellMar>
-        <w:tblLook w:val="04A0" w:firstRow="1" w:lastRow="0" w:firstColumn="1" w:lastColumn="0" w:noHBand="0" w:noVBand="1"/>
-      </w:tblPr>
-      <w:tblGrid>
-        <w:gridCol w:w="2809"/>
-        <w:gridCol w:w="1439"/>
-        <w:gridCol w:w="1559"/>
-        <w:gridCol w:w="2268"/>
-      </w:tblGrid>
-      <w:tr>
-        <w:trPr>
-          <w:tblHeader/>
-          <w:tblCellSpacing w:w="15" w:type="dxa"/>
-        </w:trPr>
-        <w:tc>
-          <w:tcPr>
-            <w:tcW w:w="0" w:type="auto"/>
-            <w:vAlign w:val="center"/>
-            <w:hideMark/>
-          </w:tcPr>
-          <w:p>
-            <w:pPr>
-              <w:rPr>
-                <w:b/>
-                <w:bCs/>
-              </w:rPr>
-            </w:pPr>
-            <w:r>
-              <w:rPr>
-                <w:b/>
-                <w:bCs/>
-              </w:rPr>
-              <w:t>Criterion</w:t>
-            </w:r>
-          </w:p>
-        </w:tc>
-        <w:tc>
-          <w:tcPr>
-            <w:tcW w:w="1409" w:type="dxa"/>
-            <w:vAlign w:val="center"/>
-            <w:hideMark/>
-          </w:tcPr>
-          <w:p>
-            <w:pPr>
-              <w:rPr>
-                <w:b/>
-                <w:bCs/>
-              </w:rPr>
-            </w:pPr>
-            <w:r>
-              <w:rPr>
-                <w:b/>
-                <w:bCs/>
-              </w:rPr>
-              <w:t>ARIMA</w:t>
-            </w:r>
-          </w:p>
-        </w:tc>
-        <w:tc>
-          <w:tcPr>
-            <w:tcW w:w="1529" w:type="dxa"/>
-            <w:vAlign w:val="center"/>
-            <w:hideMark/>
-          </w:tcPr>
-          <w:p>
-            <w:pPr>
-              <w:rPr>
-                <w:b/>
-                <w:bCs/>
-              </w:rPr>
-            </w:pPr>
-            <w:r>
-              <w:rPr>
-                <w:b/>
-                <w:bCs/>
-              </w:rPr>
-              <w:t>SARIMAX</w:t>
-            </w:r>
-          </w:p>
-        </w:tc>
-        <w:tc>
-          <w:tcPr>
-            <w:tcW w:w="2223" w:type="dxa"/>
-            <w:vAlign w:val="center"/>
-            <w:hideMark/>
-          </w:tcPr>
-          <w:p>
-            <w:pPr>
-              <w:rPr>
-                <w:b/>
-                <w:bCs/>
-              </w:rPr>
-            </w:pPr>
-            <w:r>
-              <w:rPr>
-                <w:b/>
-                <w:bCs/>
-              </w:rPr>
-              <w:t>Exponential Smoothing</w:t>
-            </w:r>
-          </w:p>
-        </w:tc>
-      </w:tr>
-      <w:tr>
-        <w:trPr>
-          <w:tblCellSpacing w:w="15" w:type="dxa"/>
-        </w:trPr>
-        <w:tc>
-          <w:tcPr>
-            <w:tcW w:w="0" w:type="auto"/>
-            <w:vAlign w:val="center"/>
-            <w:hideMark/>
-          </w:tcPr>
-          <w:p>
-            <w:r>
-              <w:t>Uses previous lap times</w:t>
-            </w:r>
-          </w:p>
-        </w:tc>
-        <w:tc>
-          <w:tcPr>
-            <w:tcW w:w="1409" w:type="dxa"/>
-            <w:vAlign w:val="center"/>
-            <w:hideMark/>
-          </w:tcPr>
-          <w:p>
-            <w:r>
-              <w:t>Yes</w:t>
-            </w:r>
-          </w:p>
-        </w:tc>
-        <w:tc>
-          <w:tcPr>
-            <w:tcW w:w="1529" w:type="dxa"/>
-            <w:vAlign w:val="center"/>
-            <w:hideMark/>
-          </w:tcPr>
-          <w:p>
-            <w:r>
-              <w:t>Yes</w:t>
-            </w:r>
-          </w:p>
-        </w:tc>
-        <w:tc>
-          <w:tcPr>
-            <w:tcW w:w="2223" w:type="dxa"/>
-            <w:vAlign w:val="center"/>
-            <w:hideMark/>
-          </w:tcPr>
-          <w:p>
-            <w:r>
-              <w:t>Yes</w:t>
-            </w:r>
-          </w:p>
-        </w:tc>
-      </w:tr>
-      <w:tr>
-        <w:trPr>
-          <w:tblCellSpacing w:w="15" w:type="dxa"/>
-        </w:trPr>
-        <w:tc>
-          <w:tcPr>
-            <w:tcW w:w="0" w:type="auto"/>
-            <w:vAlign w:val="center"/>
-            <w:hideMark/>
-          </w:tcPr>
-          <w:p>
-            <w:r>
-              <w:t>External features</w:t>
-            </w:r>
-          </w:p>
-        </w:tc>
-        <w:tc>
-          <w:tcPr>
-            <w:tcW w:w="1409" w:type="dxa"/>
-            <w:vAlign w:val="center"/>
-            <w:hideMark/>
-          </w:tcPr>
-          <w:p>
-            <w:r>
-              <w:t>No</w:t>
-            </w:r>
-          </w:p>
-        </w:tc>
-        <w:tc>
-          <w:tcPr>
-            <w:tcW w:w="1529" w:type="dxa"/>
-            <w:vAlign w:val="center"/>
-            <w:hideMark/>
-          </w:tcPr>
-          <w:p>
-            <w:r>
-              <w:t>Yes</w:t>
-            </w:r>
-          </w:p>
-        </w:tc>
-        <w:tc>
-          <w:tcPr>
-            <w:tcW w:w="2223" w:type="dxa"/>
-            <w:vAlign w:val="center"/>
-            <w:hideMark/>
-          </w:tcPr>
-          <w:p>
-            <w:r>
-              <w:t>No</w:t>
-            </w:r>
-          </w:p>
-        </w:tc>
-      </w:tr>
-      <w:tr>
-        <w:trPr>
-          <w:tblCellSpacing w:w="15" w:type="dxa"/>
-        </w:trPr>
-        <w:tc>
-          <w:tcPr>
-            <w:tcW w:w="0" w:type="auto"/>
-            <w:vAlign w:val="center"/>
-            <w:hideMark/>
-          </w:tcPr>
-          <w:p>
-            <w:r>
-              <w:t>Handles time dependency</w:t>
-            </w:r>
-          </w:p>
-        </w:tc>
-        <w:tc>
-          <w:tcPr>
-            <w:tcW w:w="1409" w:type="dxa"/>
-            <w:vAlign w:val="center"/>
-            <w:hideMark/>
-          </w:tcPr>
-          <w:p>
-            <w:r>
-              <w:t>Strong</w:t>
-            </w:r>
-          </w:p>
-        </w:tc>
-        <w:tc>
-          <w:tcPr>
-            <w:tcW w:w="1529" w:type="dxa"/>
-            <w:vAlign w:val="center"/>
-            <w:hideMark/>
-          </w:tcPr>
-          <w:p>
-            <w:r>
-              <w:t>Strong</w:t>
-            </w:r>
-          </w:p>
-        </w:tc>
-        <w:tc>
-          <w:tcPr>
-            <w:tcW w:w="2223" w:type="dxa"/>
-            <w:vAlign w:val="center"/>
-            <w:hideMark/>
-          </w:tcPr>
-          <w:p>
-            <w:r>
-              <w:t>Strong</w:t>
-            </w:r>
-          </w:p>
-        </w:tc>
-      </w:tr>
-      <w:tr>
-        <w:trPr>
-          <w:tblCellSpacing w:w="15" w:type="dxa"/>
-        </w:trPr>
-        <w:tc>
-          <w:tcPr>
-            <w:tcW w:w="0" w:type="auto"/>
-            <w:vAlign w:val="center"/>
-            <w:hideMark/>
-          </w:tcPr>
-          <w:p>
-            <w:r>
-              <w:t>Complexity</w:t>
-            </w:r>
-          </w:p>
-        </w:tc>
-        <w:tc>
-          <w:tcPr>
-            <w:tcW w:w="1409" w:type="dxa"/>
-            <w:vAlign w:val="center"/>
-            <w:hideMark/>
-          </w:tcPr>
-          <w:p>
-            <w:r>
-              <w:t>Medium</w:t>
-            </w:r>
-          </w:p>
-        </w:tc>
-        <w:tc>
-          <w:tcPr>
-            <w:tcW w:w="1529" w:type="dxa"/>
-            <w:vAlign w:val="center"/>
-            <w:hideMark/>
-          </w:tcPr>
-          <w:p>
-            <w:r>
-              <w:t>High</w:t>
-            </w:r>
-          </w:p>
-        </w:tc>
-        <w:tc>
-          <w:tcPr>
-            <w:tcW w:w="2223" w:type="dxa"/>
-            <w:vAlign w:val="center"/>
-            <w:hideMark/>
-          </w:tcPr>
-          <w:p>
-            <w:r>
-              <w:t>Low</w:t>
-            </w:r>
-          </w:p>
-        </w:tc>
-      </w:tr>
-      <w:tr>
-        <w:trPr>
-          <w:tblCellSpacing w:w="15" w:type="dxa"/>
-        </w:trPr>
-        <w:tc>
-          <w:tcPr>
-            <w:tcW w:w="0" w:type="auto"/>
-            <w:vAlign w:val="center"/>
-            <w:hideMark/>
-          </w:tcPr>
-          <w:p>
-            <w:r>
-              <w:t>Sudden race changes</w:t>
-            </w:r>
-          </w:p>
-        </w:tc>
-        <w:tc>
-          <w:tcPr>
-            <w:tcW w:w="1409" w:type="dxa"/>
-            <w:vAlign w:val="center"/>
-            <w:hideMark/>
-          </w:tcPr>
-          <w:p>
-            <w:r>
-              <w:t>Limited</w:t>
-            </w:r>
-          </w:p>
-        </w:tc>
-        <w:tc>
-          <w:tcPr>
-            <w:tcW w:w="1529" w:type="dxa"/>
-            <w:vAlign w:val="center"/>
-            <w:hideMark/>
-          </w:tcPr>
-          <w:p>
-            <w:r>
-              <w:t>Medium</w:t>
-            </w:r>
-          </w:p>
-        </w:tc>
-        <w:tc>
-          <w:tcPr>
-            <w:tcW w:w="2223" w:type="dxa"/>
-            <w:vAlign w:val="center"/>
-            <w:hideMark/>
-          </w:tcPr>
-          <w:p>
-            <w:r>
-              <w:t>Limited</w:t>
-            </w:r>
-          </w:p>
-        </w:tc>
-      </w:tr>
-    </w:tbl>
-    <w:p>
-      <w:r>
-        <w:lastRenderedPageBreak/>
-        <w:t>Based on the comparison, ARIMA was selected as the time-series model for this project. It directly focuses on temporal relationships between previous lap times and the next lap time, while keeping the implementation manageable.</w:t>
-      </w:r>
-      <w:r>
-        <w:t xml:space="preserve"> [4]</w:t>
-      </w:r>
-    </w:p>
-    <w:p>
-      <w:r>
-        <w:t>The selection at this stage is based on the characteristics and suitability of the models for the problem. Their actual predictive performance will be evaluated during the Realising phase.</w:t>
-      </w:r>
-      <w:r>
-        <w:t xml:space="preserve"> [7]</w:t>
-      </w:r>
-    </w:p>
-    <w:p>
-      <w:pPr>
-        <w:pStyle w:val="Heading2"/>
-      </w:pPr>
-      <w:bookmarkStart w:id="9" w:name="_Toc241156828"/>
-      <w:r>
-        <w:t>Conclusion</w:t>
-      </w:r>
-      <w:bookmarkEnd w:id="9"/>
-    </w:p>
-    <w:p>
-      <w:r>
-        <w:t>To sum up, the three final models are: Linear Regression, Gradient Boosting Regressor and ARIMA.</w:t>
-      </w:r>
-    </w:p>
-    <w:p>
-      <w:r>
-        <w:t>These models represent different possibilities, possible different results and approaches. They will be tested metric wise, but also how good are they for real-life scenarios and changes, to use one of them as the final version of this challenge.</w:t>
-      </w:r>
-    </w:p>
-    <w:tbl>
-      <w:tblPr>
-        <w:tblW w:w="0" w:type="auto"/>
-        <w:tblCellSpacing w:w="15" w:type="dxa"/>
-        <w:tblBorders>
-          <w:top w:val="single" w:sz="4" w:space="0" w:color="auto"/>
-          <w:left w:val="single" w:sz="4" w:space="0" w:color="auto"/>
-          <w:bottom w:val="single" w:sz="4" w:space="0" w:color="auto"/>
-          <w:right w:val="single" w:sz="4" w:space="0" w:color="auto"/>
-          <w:insideH w:val="single" w:sz="4" w:space="0" w:color="auto"/>
-          <w:insideV w:val="single" w:sz="4" w:space="0" w:color="auto"/>
-        </w:tblBorders>
-        <w:tblCellMar>
-          <w:top w:w="15" w:type="dxa"/>
-          <w:left w:w="15" w:type="dxa"/>
-          <w:bottom w:w="15" w:type="dxa"/>
-          <w:right w:w="15" w:type="dxa"/>
-        </w:tblCellMar>
-        <w:tblLook w:val="04A0" w:firstRow="1" w:lastRow="0" w:firstColumn="1" w:lastColumn="0" w:noHBand="0" w:noVBand="1"/>
-      </w:tblPr>
-      <w:tblGrid>
-        <w:gridCol w:w="1762"/>
-        <w:gridCol w:w="7254"/>
-      </w:tblGrid>
-      <w:tr>
-        <w:trPr>
-          <w:tblHeader/>
-          <w:tblCellSpacing w:w="15" w:type="dxa"/>
-        </w:trPr>
-        <w:tc>
-          <w:tcPr>
-            <w:tcW w:w="0" w:type="auto"/>
-            <w:vAlign w:val="center"/>
-            <w:hideMark/>
-          </w:tcPr>
-          <w:p>
-            <w:pPr>
-              <w:rPr>
-                <w:b/>
-                <w:bCs/>
-              </w:rPr>
-            </w:pPr>
-            <w:r>
-              <w:rPr>
-                <w:b/>
-                <w:bCs/>
-              </w:rPr>
-              <w:t>Model</w:t>
-            </w:r>
-          </w:p>
-        </w:tc>
-        <w:tc>
-          <w:tcPr>
-            <w:tcW w:w="0" w:type="auto"/>
-            <w:vAlign w:val="center"/>
-            <w:hideMark/>
-          </w:tcPr>
-          <w:p>
-            <w:pPr>
-              <w:rPr>
-                <w:b/>
-                <w:bCs/>
-              </w:rPr>
-            </w:pPr>
-            <w:r>
-              <w:rPr>
-                <w:b/>
-                <w:bCs/>
-              </w:rPr>
-              <w:t>Reason for Selection</w:t>
-            </w:r>
-          </w:p>
-        </w:tc>
-      </w:tr>
-      <w:tr>
-        <w:trPr>
-          <w:tblCellSpacing w:w="15" w:type="dxa"/>
-        </w:trPr>
-        <w:tc>
-          <w:tcPr>
-            <w:tcW w:w="0" w:type="auto"/>
-            <w:vAlign w:val="center"/>
-            <w:hideMark/>
-          </w:tcPr>
-          <w:p>
-            <w:r>
-              <w:t>Linear Regression</w:t>
-            </w:r>
-          </w:p>
-        </w:tc>
-        <w:tc>
-          <w:tcPr>
-            <w:tcW w:w="0" w:type="auto"/>
-            <w:vAlign w:val="center"/>
-            <w:hideMark/>
-          </w:tcPr>
-          <w:p>
-            <w:r>
-              <w:t>Provides a simple and interpretable regression baseline.</w:t>
-            </w:r>
-            <w:r>
-              <w:t xml:space="preserve"> [1]</w:t>
-            </w:r>
-          </w:p>
-        </w:tc>
-      </w:tr>
-      <w:tr>
-        <w:trPr>
-          <w:tblCellSpacing w:w="15" w:type="dxa"/>
-        </w:trPr>
-        <w:tc>
-          <w:tcPr>
-            <w:tcW w:w="0" w:type="auto"/>
-            <w:vAlign w:val="center"/>
-            <w:hideMark/>
-          </w:tcPr>
-          <w:p>
-            <w:r>
-              <w:t>Gradient Boosting</w:t>
-            </w:r>
-          </w:p>
-        </w:tc>
-        <w:tc>
-          <w:tcPr>
-            <w:tcW w:w="0" w:type="auto"/>
-            <w:vAlign w:val="center"/>
-            <w:hideMark/>
-          </w:tcPr>
-          <w:p>
-            <w:r>
-              <w:t>Handles nonlinear relationships and interactions between race features.</w:t>
-            </w:r>
-            <w:r>
-              <w:t xml:space="preserve"> [3]</w:t>
-            </w:r>
-          </w:p>
-        </w:tc>
-      </w:tr>
-      <w:tr>
-        <w:trPr>
-          <w:tblCellSpacing w:w="15" w:type="dxa"/>
-        </w:trPr>
-        <w:tc>
-          <w:tcPr>
-            <w:tcW w:w="0" w:type="auto"/>
-            <w:vAlign w:val="center"/>
-            <w:hideMark/>
-          </w:tcPr>
-          <w:p>
-            <w:r>
-              <w:t>ARIMA</w:t>
-            </w:r>
-          </w:p>
-        </w:tc>
-        <w:tc>
-          <w:tcPr>
-            <w:tcW w:w="0" w:type="auto"/>
-            <w:vAlign w:val="center"/>
-            <w:hideMark/>
-          </w:tcPr>
-          <w:p>
-            <w:r>
-              <w:t>Provides a time-series approach focused on temporal relationships between lap times.</w:t>
-            </w:r>
-            <w:r>
-              <w:t xml:space="preserve"> [4]</w:t>
-            </w:r>
-          </w:p>
-        </w:tc>
-      </w:tr>
-    </w:tbl>
-    <w:p>
-      <w:r>
-        <w:t>The selection at this stage is based on the characteristics and suitability of the models for the problem. Their actual predictive performance will be evaluated during the Realising phase.</w:t>
-      </w:r>
-      <w:r>
-        <w:t xml:space="preserve"> [7]</w:t>
-      </w:r>
-    </w:p>
-    <w:p/>
-    <w:p/>
-    <w:p>
-      <w:pPr>
-        <w:pStyle w:val="Heading2"/>
-      </w:pPr>
-      <w:bookmarkStart w:id="10" w:name="_Toc241156829"/>
+      <w:bookmarkStart w:id="16" w:name="_Toc241582166"/>
       <w:r>
         <w:t>References</w:t>
       </w:r>
-      <w:bookmarkEnd w:id="10"/>
-    </w:p>
-    <w:p>
-      <w:r>
-        <w:t xml:space="preserve">[1] Scikit-learn developers. </w:t>
-      </w:r>
-      <w:proofErr w:type="spellStart"/>
-      <w:r>
-        <w:t>LinearRegression</w:t>
-      </w:r>
-      <w:proofErr w:type="spellEnd"/>
-      <w:r>
-        <w:t xml:space="preserve">, Ordinary Least Squares. </w:t>
-      </w:r>
-      <w:hyperlink r:id="rId6">
+      <w:bookmarkEnd w:id="16"/>
+    </w:p>
+    <w:p>
+      <w:r>
+        <w:t xml:space="preserve">[1] Scikit-learn developers. LinearRegression, Ordinary Least Squares. </w:t>
+      </w:r>
+      <w:hyperlink r:id="rId31">
         <w:r>
           <w:rPr>
             <w:color w:val="0563C1"/>
@@ -2119,80 +2540,80 @@
     </w:p>
     <w:p>
       <w:r>
-        <w:t xml:space="preserve">[2] Scikit-learn. </w:t>
-      </w:r>
-      <w:proofErr w:type="spellStart"/>
-      <w:r>
-        <w:t>RandomForestRegressor</w:t>
-      </w:r>
-      <w:proofErr w:type="spellEnd"/>
-      <w:r>
-        <w:t xml:space="preserve">. Available at: </w:t>
-      </w:r>
-      <w:hyperlink r:id="rId7" w:history="1">
-        <w:r>
-          <w:rPr>
-            <w:rStyle w:val="Hyperlink"/>
-          </w:rPr>
-          <w:t>https://scikit-learn.org/stable/modules/generated/sklearn.ensemble.RandomForestRegressor.html</w:t>
-        </w:r>
-      </w:hyperlink>
-    </w:p>
-    <w:p>
-      <w:r>
-        <w:t xml:space="preserve">[3] Scikit-learn. Gradient Boosting Regression. Available at: </w:t>
-      </w:r>
-      <w:hyperlink r:id="rId8" w:history="1">
-        <w:r>
-          <w:rPr>
-            <w:rStyle w:val="Hyperlink"/>
-          </w:rPr>
-          <w:t>https://scikit-learn.org/stable/auto_examples/ensemble/plot_gradient_boosting_regression.html</w:t>
-        </w:r>
-      </w:hyperlink>
-    </w:p>
-    <w:p>
-      <w:r>
-        <w:lastRenderedPageBreak/>
-        <w:t xml:space="preserve">[4] Hyndman, R. J. &amp; Athanasopoulos, G. Forecasting: Principles and Practice, 3rd ed., Chapter 9: ARIMA models. </w:t>
-      </w:r>
-      <w:hyperlink r:id="rId9">
+        <w:t xml:space="preserve">[2] Hyndman, R. J. &amp; Athanasopoulos, G. Forecasting: Principles and Practice, 3rd ed., Some simple forecasting methods. </w:t>
+      </w:r>
+      <w:hyperlink r:id="rId32">
         <w:r>
           <w:rPr>
             <w:color w:val="0563C1"/>
             <w:u w:val="single"/>
           </w:rPr>
-          <w:t>https://otexts.com/fpp3/arima.html</w:t>
+          <w:t>https://otexts.com/fpp3/simple-methods.html</w:t>
         </w:r>
       </w:hyperlink>
     </w:p>
     <w:p>
       <w:r>
-        <w:t xml:space="preserve">[5] </w:t>
-      </w:r>
-      <w:proofErr w:type="spellStart"/>
-      <w:r>
-        <w:t>Statsmodels</w:t>
-      </w:r>
-      <w:proofErr w:type="spellEnd"/>
-      <w:r>
-        <w:t xml:space="preserve">. SARIMAX documentation. </w:t>
-      </w:r>
-      <w:hyperlink r:id="rId10">
+        <w:t xml:space="preserve">[3] Hyndman, R. J. &amp; Athanasopoulos, G. Forecasting: Principles and Practice, 3rd ed., Non-seasonal ARIMA models. </w:t>
+      </w:r>
+      <w:hyperlink r:id="rId33">
         <w:r>
           <w:rPr>
             <w:color w:val="0563C1"/>
             <w:u w:val="single"/>
           </w:rPr>
-          <w:t>https://www.statsmodels.org/dev/generated/statsmodels.tsa.statespace.sarimax.SARIMAX.html</w:t>
+          <w:t>https://otexts.com/fpp3/non-seasonal-arima.html</w:t>
         </w:r>
       </w:hyperlink>
     </w:p>
     <w:p>
       <w:r>
-        <w:t xml:space="preserve">[6] Hyndman, R. J. &amp; Athanasopoulos, G. Forecasting: Principles and Practice, 3rd ed., Simple exponential smoothing. </w:t>
-      </w:r>
-      <w:hyperlink r:id="rId11">
+        <w:t xml:space="preserve">[4] Hyndman, R. J. &amp; Athanasopoulos, G. Forecasting: Principles and Practice, 3rd ed., Stationarity and differencing. </w:t>
+      </w:r>
+      <w:hyperlink r:id="rId34">
+        <w:r>
+          <w:rPr>
+            <w:color w:val="0563C1"/>
+            <w:u w:val="single"/>
+          </w:rPr>
+          <w:t>https://otexts.com/fpp3/stationarity.html</w:t>
+        </w:r>
+      </w:hyperlink>
+    </w:p>
+    <w:p>
+      <w:r>
+        <w:lastRenderedPageBreak/>
+        <w:t xml:space="preserve">[5] Hyndman, R. J. &amp; Athanasopoulos, G. Forecasting: Principles and Practice, 3rd ed., Dynamic regression models. </w:t>
+      </w:r>
+      <w:hyperlink r:id="rId35">
+        <w:r>
+          <w:rPr>
+            <w:color w:val="0563C1"/>
+            <w:u w:val="single"/>
+          </w:rPr>
+          <w:t>https://otexts.com/fpp3/dynamic.html</w:t>
+        </w:r>
+      </w:hyperlink>
+    </w:p>
+    <w:p>
+      <w:r>
+        <w:t xml:space="preserve">[6] Statsmodels. SARIMAX documentation. </w:t>
+      </w:r>
+      <w:hyperlink r:id="rId36">
+        <w:r>
+          <w:rPr>
+            <w:color w:val="0563C1"/>
+            <w:u w:val="single"/>
+          </w:rPr>
+          <w:t>https://www.statsmodels.org/stable/generated/statsmodels.tsa.statespace.sarimax.SARIMAX.html</w:t>
+        </w:r>
+      </w:hyperlink>
+    </w:p>
+    <w:p>
+      <w:r>
+        <w:t xml:space="preserve">[7] Hyndman, R. J. &amp; Athanasopoulos, G. Forecasting: Principles and Practice, 3rd ed., Simple exponential smoothing. </w:t>
+      </w:r>
+      <w:hyperlink r:id="rId37">
         <w:r>
           <w:rPr>
             <w:color w:val="0563C1"/>
@@ -2204,15 +2625,71 @@
     </w:p>
     <w:p>
       <w:r>
-        <w:t xml:space="preserve">[7] Hyndman, R. J. &amp; Athanasopoulos, G. Forecasting: Principles and Practice, 3rd ed., Basic steps in a forecasting task. </w:t>
-      </w:r>
-      <w:hyperlink r:id="rId12">
+        <w:t xml:space="preserve">[8] Hyndman, R. J. &amp; Athanasopoulos, G. Forecasting: Principles and Practice, 3rd ed., Methods with trend. </w:t>
+      </w:r>
+      <w:hyperlink r:id="rId38">
         <w:r>
           <w:rPr>
             <w:color w:val="0563C1"/>
             <w:u w:val="single"/>
           </w:rPr>
-          <w:t>https://otexts.com/fpp3/basic-steps.html</w:t>
+          <w:t>https://otexts.com/fpp3/holt.html</w:t>
+        </w:r>
+      </w:hyperlink>
+    </w:p>
+    <w:p>
+      <w:r>
+        <w:t xml:space="preserve">[9] Keras. Timeseries forecasting for weather prediction. </w:t>
+      </w:r>
+      <w:hyperlink r:id="rId39">
+        <w:r>
+          <w:rPr>
+            <w:color w:val="0563C1"/>
+            <w:u w:val="single"/>
+          </w:rPr>
+          <w:t>https://keras.io/examples/timeseries/timeseries_weather_forecasting/</w:t>
+        </w:r>
+      </w:hyperlink>
+    </w:p>
+    <w:p>
+      <w:r>
+        <w:t xml:space="preserve">[10] Hyndman, R. J. &amp; Athanasopoulos, G. Forecasting: Principles and Practice, 3rd ed., Forecasting with regression models with ARIMA errors. </w:t>
+      </w:r>
+      <w:hyperlink r:id="rId40">
+        <w:r>
+          <w:rPr>
+            <w:color w:val="0563C1"/>
+            <w:u w:val="single"/>
+          </w:rPr>
+          <w:t>https://otexts.com/fpp3/forecasting.html</w:t>
+        </w:r>
+      </w:hyperlink>
+    </w:p>
+    <w:p>
+      <w:r>
+        <w:t xml:space="preserve">[11] Hyndman, R. J. &amp; Athanasopoulos, G. Forecasting: Principles and Practice, 3rd ed., Time series cross-validation. </w:t>
+      </w:r>
+      <w:hyperlink r:id="rId41">
+        <w:r>
+          <w:rPr>
+            <w:color w:val="0563C1"/>
+            <w:u w:val="single"/>
+          </w:rPr>
+          <w:t>https://otexts.com/fpp3/tscv.html</w:t>
+        </w:r>
+      </w:hyperlink>
+    </w:p>
+    <w:p>
+      <w:r>
+        <w:t xml:space="preserve">[12] Hyndman, R. J. &amp; Athanasopoulos, G. Forecasting: Principles and Practice, 3rd ed., Evaluating point forecast accuracy. </w:t>
+      </w:r>
+      <w:hyperlink r:id="rId42">
+        <w:r>
+          <w:rPr>
+            <w:color w:val="0563C1"/>
+            <w:u w:val="single"/>
+          </w:rPr>
+          <w:t>https://otexts.com/fpp3/accuracy.html</w:t>
         </w:r>
       </w:hyperlink>
     </w:p>
@@ -2229,6 +2706,119 @@
 <file path=word/numbering.xml><?xml version="1.0" encoding="utf-8"?>
 <w:numbering xmlns:wpc="http://schemas.microsoft.com/office/word/2010/wordprocessingCanvas" xmlns:cx="http://schemas.microsoft.com/office/drawing/2014/chartex" xmlns:cx1="http://schemas.microsoft.com/office/drawing/2015/9/8/chartex" xmlns:cx2="http://schemas.microsoft.com/office/drawing/2015/10/21/chartex" xmlns:cx3="http://schemas.microsoft.com/office/drawing/2016/5/9/chartex" xmlns:cx4="http://schemas.microsoft.com/office/drawing/2016/5/10/chartex" xmlns:cx5="http://schemas.microsoft.com/office/drawing/2016/5/11/chartex" xmlns:cx6="http://schemas.microsoft.com/office/drawing/2016/5/12/chartex" xmlns:cx7="http://schemas.microsoft.com/office/drawing/2016/5/13/chartex" xmlns:cx8="http://schemas.microsoft.com/office/drawing/2016/5/14/chartex" xmlns:mc="http://schemas.openxmlformats.org/markup-compatibility/2006" xmlns:aink="http://schemas.microsoft.com/office/drawing/2016/ink" xmlns:am3d="http://schemas.microsoft.com/office/drawing/2017/model3d" xmlns:o="urn:schemas-microsoft-com:office:office" xmlns:oel="http://schemas.microsoft.com/office/2019/extlst" xmlns:r="http://schemas.openxmlformats.org/officeDocument/2006/relationships" xmlns:m="http://schemas.openxmlformats.org/officeDocument/2006/math" xmlns:v="urn:schemas-microsoft-com:vml" xmlns:wp14="http://schemas.microsoft.com/office/word/2010/wordprocessingDrawing" xmlns:wp="http://schemas.openxmlformats.org/drawingml/2006/wordprocessingDrawing" xmlns:w10="urn:schemas-microsoft-com:office:word" xmlns:w="http://schemas.openxmlformats.org/wordprocessingml/2006/main" xmlns:w14="http://schemas.microsoft.com/office/word/2010/wordml" xmlns:w15="http://schemas.microsoft.com/office/word/2012/wordml" xmlns:w16cex="http://schemas.microsoft.com/office/word/2018/wordml/cex" xmlns:w16cid="http://schemas.microsoft.com/office/word/2016/wordml/cid" xmlns:w16="http://schemas.microsoft.com/office/word/2018/wordml" xmlns:w16du="http://schemas.microsoft.com/office/word/2023/wordml/word16du" xmlns:w16sdtdh="http://schemas.microsoft.com/office/word/2020/wordml/sdtdatahash" xmlns:w16sdtfl="http://schemas.microsoft.com/office/word/2024/wordml/sdtformatlock" xmlns:w16se="http://schemas.microsoft.com/office/word/2015/wordml/symex" xmlns:wpg="http://schemas.microsoft.com/office/word/2010/wordprocessingGroup" xmlns:wpi="http://schemas.microsoft.com/office/word/2010/wordprocessingInk" xmlns:wne="http://schemas.microsoft.com/office/word/2006/wordml" xmlns:wps="http://schemas.microsoft.com/office/word/2010/wordprocessingShape" mc:Ignorable="w14 w15 w16se w16cid w16 w16cex w16sdtdh w16sdtfl w16du wp14">
   <w:abstractNum w:abstractNumId="0" w15:restartNumberingAfterBreak="0">
+    <w:nsid w:val="29FB3E89"/>
+    <w:multiLevelType w:val="hybridMultilevel"/>
+    <w:tmpl w:val="97C27DC0"/>
+    <w:lvl w:ilvl="0" w:tplc="08090001">
+      <w:start w:val="1"/>
+      <w:numFmt w:val="bullet"/>
+      <w:lvlText w:val=""/>
+      <w:lvlJc w:val="left"/>
+      <w:pPr>
+        <w:ind w:left="720" w:hanging="360"/>
+      </w:pPr>
+      <w:rPr>
+        <w:rFonts w:ascii="Symbol" w:hAnsi="Symbol" w:hint="default"/>
+      </w:rPr>
+    </w:lvl>
+    <w:lvl w:ilvl="1" w:tplc="08090003" w:tentative="1">
+      <w:start w:val="1"/>
+      <w:numFmt w:val="bullet"/>
+      <w:lvlText w:val="o"/>
+      <w:lvlJc w:val="left"/>
+      <w:pPr>
+        <w:ind w:left="1440" w:hanging="360"/>
+      </w:pPr>
+      <w:rPr>
+        <w:rFonts w:ascii="Courier New" w:hAnsi="Courier New" w:cs="Courier New" w:hint="default"/>
+      </w:rPr>
+    </w:lvl>
+    <w:lvl w:ilvl="2" w:tplc="08090005" w:tentative="1">
+      <w:start w:val="1"/>
+      <w:numFmt w:val="bullet"/>
+      <w:lvlText w:val=""/>
+      <w:lvlJc w:val="left"/>
+      <w:pPr>
+        <w:ind w:left="2160" w:hanging="360"/>
+      </w:pPr>
+      <w:rPr>
+        <w:rFonts w:ascii="Wingdings" w:hAnsi="Wingdings" w:hint="default"/>
+      </w:rPr>
+    </w:lvl>
+    <w:lvl w:ilvl="3" w:tplc="08090001" w:tentative="1">
+      <w:start w:val="1"/>
+      <w:numFmt w:val="bullet"/>
+      <w:lvlText w:val=""/>
+      <w:lvlJc w:val="left"/>
+      <w:pPr>
+        <w:ind w:left="2880" w:hanging="360"/>
+      </w:pPr>
+      <w:rPr>
+        <w:rFonts w:ascii="Symbol" w:hAnsi="Symbol" w:hint="default"/>
+      </w:rPr>
+    </w:lvl>
+    <w:lvl w:ilvl="4" w:tplc="08090003" w:tentative="1">
+      <w:start w:val="1"/>
+      <w:numFmt w:val="bullet"/>
+      <w:lvlText w:val="o"/>
+      <w:lvlJc w:val="left"/>
+      <w:pPr>
+        <w:ind w:left="3600" w:hanging="360"/>
+      </w:pPr>
+      <w:rPr>
+        <w:rFonts w:ascii="Courier New" w:hAnsi="Courier New" w:cs="Courier New" w:hint="default"/>
+      </w:rPr>
+    </w:lvl>
+    <w:lvl w:ilvl="5" w:tplc="08090005" w:tentative="1">
+      <w:start w:val="1"/>
+      <w:numFmt w:val="bullet"/>
+      <w:lvlText w:val=""/>
+      <w:lvlJc w:val="left"/>
+      <w:pPr>
+        <w:ind w:left="4320" w:hanging="360"/>
+      </w:pPr>
+      <w:rPr>
+        <w:rFonts w:ascii="Wingdings" w:hAnsi="Wingdings" w:hint="default"/>
+      </w:rPr>
+    </w:lvl>
+    <w:lvl w:ilvl="6" w:tplc="08090001" w:tentative="1">
+      <w:start w:val="1"/>
+      <w:numFmt w:val="bullet"/>
+      <w:lvlText w:val=""/>
+      <w:lvlJc w:val="left"/>
+      <w:pPr>
+        <w:ind w:left="5040" w:hanging="360"/>
+      </w:pPr>
+      <w:rPr>
+        <w:rFonts w:ascii="Symbol" w:hAnsi="Symbol" w:hint="default"/>
+      </w:rPr>
+    </w:lvl>
+    <w:lvl w:ilvl="7" w:tplc="08090003" w:tentative="1">
+      <w:start w:val="1"/>
+      <w:numFmt w:val="bullet"/>
+      <w:lvlText w:val="o"/>
+      <w:lvlJc w:val="left"/>
+      <w:pPr>
+        <w:ind w:left="5760" w:hanging="360"/>
+      </w:pPr>
+      <w:rPr>
+        <w:rFonts w:ascii="Courier New" w:hAnsi="Courier New" w:cs="Courier New" w:hint="default"/>
+      </w:rPr>
+    </w:lvl>
+    <w:lvl w:ilvl="8" w:tplc="08090005" w:tentative="1">
+      <w:start w:val="1"/>
+      <w:numFmt w:val="bullet"/>
+      <w:lvlText w:val=""/>
+      <w:lvlJc w:val="left"/>
+      <w:pPr>
+        <w:ind w:left="6480" w:hanging="360"/>
+      </w:pPr>
+      <w:rPr>
+        <w:rFonts w:ascii="Wingdings" w:hAnsi="Wingdings" w:hint="default"/>
+      </w:rPr>
+    </w:lvl>
+  </w:abstractNum>
+  <w:abstractNum w:abstractNumId="1" w15:restartNumberingAfterBreak="0">
     <w:nsid w:val="618C0C01"/>
     <w:multiLevelType w:val="hybridMultilevel"/>
     <w:tmpl w:val="78C22316"/>
@@ -2342,6 +2932,9 @@
     </w:lvl>
   </w:abstractNum>
   <w:num w:numId="1" w16cid:durableId="1425146001">
+    <w:abstractNumId w:val="1"/>
+  </w:num>
+  <w:num w:numId="2" w16cid:durableId="1401246993">
     <w:abstractNumId w:val="0"/>
   </w:num>
 </w:numbering>
@@ -3340,6 +3933,17 @@
       <w:ind w:left="480"/>
     </w:pPr>
   </w:style>
+  <w:style w:type="paragraph" w:styleId="NormalWeb">
+    <w:name w:val="Normal (Web)"/>
+    <w:basedOn w:val="Normal"/>
+    <w:uiPriority w:val="99"/>
+    <w:semiHidden/>
+    <w:unhideWhenUsed/>
+    <w:rsid w:val="00430C79"/>
+    <w:rPr>
+      <w:rFonts w:ascii="Times New Roman" w:hAnsi="Times New Roman" w:cs="Times New Roman"/>
+    </w:rPr>
+  </w:style>
 </w:styles>
 </file>
 

</xml_diff>